<commit_message>
Add SQL scripts for concurrent transactions, backup, and recovery demonstrations
- Created Accounts table and inserted initial data
- Demonstrated various transaction isolation levels: READ COMMITTED, REPEATABLE READ, and SERIALIZABLE
- Included examples of dirty reads and phantom reads
- Implemented backup and recovery procedures for AdventureWorks2008 database
- Added differential and log backup examples
- Created Plan2Recover database with backup and restore procedures
</commit_message>
<xml_diff>
--- a/iuh/môn/hcsdl/Cuối kì/Đề minh họa ôn CK HQT_CSDL DHTH17.docx
+++ b/iuh/môn/hcsdl/Cuối kì/Đề minh họa ôn CK HQT_CSDL DHTH17.docx
@@ -2,260 +2,81 @@
 <file path=word/document.xml><?xml version="1.0" encoding="utf-8"?>
 <w:document xmlns:wpc="http://schemas.microsoft.com/office/word/2010/wordprocessingCanvas" xmlns:cx="http://schemas.microsoft.com/office/drawing/2014/chartex" xmlns:cx1="http://schemas.microsoft.com/office/drawing/2015/9/8/chartex" xmlns:cx2="http://schemas.microsoft.com/office/drawing/2015/10/21/chartex" xmlns:cx3="http://schemas.microsoft.com/office/drawing/2016/5/9/chartex" xmlns:cx4="http://schemas.microsoft.com/office/drawing/2016/5/10/chartex" xmlns:cx5="http://schemas.microsoft.com/office/drawing/2016/5/11/chartex" xmlns:cx6="http://schemas.microsoft.com/office/drawing/2016/5/12/chartex" xmlns:cx7="http://schemas.microsoft.com/office/drawing/2016/5/13/chartex" xmlns:cx8="http://schemas.microsoft.com/office/drawing/2016/5/14/chartex" xmlns:mc="http://schemas.openxmlformats.org/markup-compatibility/2006" xmlns:aink="http://schemas.microsoft.com/office/drawing/2016/ink" xmlns:am3d="http://schemas.microsoft.com/office/drawing/2017/model3d" xmlns:o="urn:schemas-microsoft-com:office:office" xmlns:oel="http://schemas.microsoft.com/office/2019/extlst" xmlns:r="http://schemas.openxmlformats.org/officeDocument/2006/relationships" xmlns:m="http://schemas.openxmlformats.org/officeDocument/2006/math" xmlns:v="urn:schemas-microsoft-com:vml" xmlns:wp14="http://schemas.microsoft.com/office/word/2010/wordprocessingDrawing" xmlns:wp="http://schemas.openxmlformats.org/drawingml/2006/wordprocessingDrawing" xmlns:w10="urn:schemas-microsoft-com:office:word" xmlns:w="http://schemas.openxmlformats.org/wordprocessingml/2006/main" xmlns:w14="http://schemas.microsoft.com/office/word/2010/wordml" xmlns:w15="http://schemas.microsoft.com/office/word/2012/wordml" xmlns:w16cex="http://schemas.microsoft.com/office/word/2018/wordml/cex" xmlns:w16cid="http://schemas.microsoft.com/office/word/2016/wordml/cid" xmlns:w16="http://schemas.microsoft.com/office/word/2018/wordml" xmlns:w16du="http://schemas.microsoft.com/office/word/2023/wordml/word16du" xmlns:w16sdtdh="http://schemas.microsoft.com/office/word/2020/wordml/sdtdatahash" xmlns:w16sdtfl="http://schemas.microsoft.com/office/word/2024/wordml/sdtformatlock" xmlns:w16se="http://schemas.microsoft.com/office/word/2015/wordml/symex" xmlns:wpg="http://schemas.microsoft.com/office/word/2010/wordprocessingGroup" xmlns:wpi="http://schemas.microsoft.com/office/word/2010/wordprocessingInk" xmlns:wne="http://schemas.microsoft.com/office/word/2006/wordml" xmlns:wps="http://schemas.microsoft.com/office/word/2010/wordprocessingShape" mc:Ignorable="w14 w15 w16se w16cid w16 w16cex w16sdtdh w16sdtfl w16du wp14">
   <w:body>
-    <w:tbl>
-      <w:tblPr>
-        <w:tblStyle w:val="TableGrid"/>
-        <w:tblW w:w="5000" w:type="pct"/>
-        <w:tblBorders>
-          <w:top w:val="none" w:sz="0" w:space="0" w:color="auto"/>
-          <w:left w:val="none" w:sz="0" w:space="0" w:color="auto"/>
-          <w:bottom w:val="none" w:sz="0" w:space="0" w:color="auto"/>
-          <w:right w:val="none" w:sz="0" w:space="0" w:color="auto"/>
-          <w:insideH w:val="none" w:sz="0" w:space="0" w:color="auto"/>
-          <w:insideV w:val="none" w:sz="0" w:space="0" w:color="auto"/>
-        </w:tblBorders>
-        <w:tblLook w:val="04A0" w:firstRow="1" w:lastRow="0" w:firstColumn="1" w:lastColumn="0" w:noHBand="0" w:noVBand="1"/>
-      </w:tblPr>
-      <w:tblGrid>
-        <w:gridCol w:w="4844"/>
-        <w:gridCol w:w="4794"/>
-      </w:tblGrid>
-      <w:tr>
-        <w:tc>
-          <w:tcPr>
-            <w:tcW w:w="2513" w:type="pct"/>
-          </w:tcPr>
-          <w:p>
-            <w:pPr>
-              <w:spacing w:line="360" w:lineRule="auto"/>
-              <w:jc w:val="center"/>
-              <w:rPr>
-                <w:b/>
-                <w:bCs/>
-              </w:rPr>
-            </w:pPr>
-            <w:r>
-              <w:rPr>
-                <w:b/>
-                <w:bCs/>
-              </w:rPr>
-              <w:t>TRƯỜNG ĐẠI HỌC CÔNG NGHIỆP</w:t>
-            </w:r>
-          </w:p>
-          <w:p>
-            <w:pPr>
-              <w:spacing w:line="360" w:lineRule="auto"/>
-              <w:jc w:val="center"/>
-              <w:rPr>
-                <w:b/>
-                <w:bCs/>
-              </w:rPr>
-            </w:pPr>
-            <w:r>
-              <w:rPr>
-                <w:b/>
-                <w:bCs/>
-              </w:rPr>
-              <w:t>THÀNH PHỐ HỒ CHÍ MINH</w:t>
-            </w:r>
-          </w:p>
-          <w:p>
-            <w:pPr>
-              <w:spacing w:line="360" w:lineRule="auto"/>
-              <w:jc w:val="center"/>
-              <w:rPr>
-                <w:b/>
-                <w:bCs/>
-              </w:rPr>
-            </w:pPr>
-            <w:r>
-              <w:rPr>
-                <w:b/>
-                <w:bCs/>
-              </w:rPr>
-              <w:t>--------------------</w:t>
-            </w:r>
-          </w:p>
-          <w:p>
-            <w:pPr>
-              <w:spacing w:line="360" w:lineRule="auto"/>
-              <w:jc w:val="center"/>
-            </w:pPr>
-            <w:r>
-              <w:rPr>
-                <w:b/>
-                <w:bCs/>
-              </w:rPr>
-              <w:t xml:space="preserve">KHOA </w:t>
-            </w:r>
-            <w:r>
-              <w:rPr>
-                <w:b/>
-                <w:bCs/>
-              </w:rPr>
-              <w:t>CÔNG NGHỆ THÔNG TIN</w:t>
-            </w:r>
-          </w:p>
-        </w:tc>
-        <w:tc>
-          <w:tcPr>
-            <w:tcW w:w="2487" w:type="pct"/>
-          </w:tcPr>
-          <w:p>
-            <w:pPr>
-              <w:spacing w:line="360" w:lineRule="auto"/>
-              <w:rPr>
-                <w:b/>
-                <w:bCs/>
-              </w:rPr>
-            </w:pPr>
-            <w:r>
-              <w:rPr>
-                <w:b/>
-                <w:bCs/>
-              </w:rPr>
-              <w:t>ĐỀ MINH HỌA</w:t>
-            </w:r>
-            <w:r>
-              <w:rPr>
-                <w:b/>
-                <w:bCs/>
-              </w:rPr>
-              <w:t xml:space="preserve"> ÔN </w:t>
-            </w:r>
-            <w:r>
-              <w:rPr>
-                <w:b/>
-                <w:bCs/>
-              </w:rPr>
-              <w:t xml:space="preserve">THI </w:t>
-            </w:r>
-            <w:r>
-              <w:rPr>
-                <w:b/>
-                <w:bCs/>
-              </w:rPr>
-              <w:t>CUỐI</w:t>
-            </w:r>
-            <w:r>
-              <w:rPr>
-                <w:b/>
-                <w:bCs/>
-              </w:rPr>
-              <w:t xml:space="preserve"> KÌ</w:t>
-            </w:r>
-            <w:r>
-              <w:rPr>
-                <w:b/>
-                <w:bCs/>
-              </w:rPr>
-              <w:t xml:space="preserve"> 0</w:t>
-            </w:r>
-            <w:r>
-              <w:rPr>
-                <w:b/>
-                <w:bCs/>
-              </w:rPr>
-              <w:t>3</w:t>
-            </w:r>
-          </w:p>
-          <w:p>
-            <w:pPr>
-              <w:spacing w:line="360" w:lineRule="auto"/>
-            </w:pPr>
-            <w:r>
-              <w:rPr>
-                <w:b/>
-                <w:bCs/>
-              </w:rPr>
-              <w:t>Môn thi:</w:t>
-            </w:r>
-            <w:r>
-              <w:t xml:space="preserve"> </w:t>
-            </w:r>
-            <w:r>
-              <w:t xml:space="preserve">Hệ quản trị </w:t>
-            </w:r>
-            <w:r>
-              <w:t>cơ sở dữ liệu</w:t>
-            </w:r>
-          </w:p>
-          <w:p>
-            <w:pPr>
-              <w:spacing w:line="360" w:lineRule="auto"/>
-            </w:pPr>
-            <w:r>
-              <w:rPr>
-                <w:b/>
-                <w:bCs/>
-              </w:rPr>
-              <w:t>Lớp:</w:t>
-            </w:r>
-            <w:r>
-              <w:t xml:space="preserve"> DH</w:t>
-            </w:r>
-            <w:r>
-              <w:t>TH</w:t>
-            </w:r>
-            <w:r>
-              <w:t>1</w:t>
-            </w:r>
-            <w:r>
-              <w:t>7</w:t>
-            </w:r>
-          </w:p>
-          <w:p>
-            <w:pPr>
-              <w:spacing w:line="360" w:lineRule="auto"/>
-            </w:pPr>
-            <w:r>
-              <w:rPr>
-                <w:b/>
-                <w:bCs/>
-              </w:rPr>
-              <w:t>Ngày thi:</w:t>
-            </w:r>
-            <w:r>
-              <w:t xml:space="preserve"> 202</w:t>
-            </w:r>
-            <w:r>
-              <w:t>4</w:t>
-            </w:r>
-          </w:p>
-          <w:p>
-            <w:pPr>
-              <w:spacing w:line="360" w:lineRule="auto"/>
-            </w:pPr>
-            <w:r>
-              <w:rPr>
-                <w:b/>
-                <w:bCs/>
-              </w:rPr>
-              <w:t>Thời gian:</w:t>
-            </w:r>
-            <w:r>
-              <w:rPr>
-                <w:b/>
-                <w:bCs/>
-              </w:rPr>
-              <w:t xml:space="preserve"> 60</w:t>
-            </w:r>
-            <w:r>
-              <w:t xml:space="preserve"> phút</w:t>
-            </w:r>
-          </w:p>
-        </w:tc>
-      </w:tr>
-    </w:tbl>
     <w:p>
       <w:pPr>
-        <w:tabs>
-          <w:tab w:val="left" w:leader="dot" w:pos="3402"/>
-        </w:tabs>
-        <w:spacing w:line="360" w:lineRule="auto"/>
-      </w:pPr>
-      <w:r>
-        <w:t xml:space="preserve">Họ và tên thí sinh ………………….…………………; MSSV: ……………… </w:t>
+        <w:spacing w:after="0" w:line="360" w:lineRule="auto"/>
+        <w:jc w:val="both"/>
+      </w:pPr>
+      <w:proofErr w:type="spellStart"/>
+      <w:r>
+        <w:rPr>
+          <w:b/>
+          <w:bCs/>
+        </w:rPr>
+        <w:t>Cơ</w:t>
+      </w:r>
+      <w:proofErr w:type="spellEnd"/>
+      <w:r>
+        <w:rPr>
+          <w:b/>
+          <w:bCs/>
+        </w:rPr>
+        <w:t xml:space="preserve"> </w:t>
+      </w:r>
+      <w:proofErr w:type="spellStart"/>
+      <w:r>
+        <w:rPr>
+          <w:b/>
+          <w:bCs/>
+        </w:rPr>
+        <w:t>sở</w:t>
+      </w:r>
+      <w:proofErr w:type="spellEnd"/>
+      <w:r>
+        <w:rPr>
+          <w:b/>
+          <w:bCs/>
+        </w:rPr>
+        <w:t xml:space="preserve"> </w:t>
+      </w:r>
+      <w:proofErr w:type="spellStart"/>
+      <w:r>
+        <w:rPr>
+          <w:b/>
+          <w:bCs/>
+        </w:rPr>
+        <w:t>dữ</w:t>
+      </w:r>
+      <w:proofErr w:type="spellEnd"/>
+      <w:r>
+        <w:rPr>
+          <w:b/>
+          <w:bCs/>
+        </w:rPr>
+        <w:t xml:space="preserve"> </w:t>
+      </w:r>
+      <w:proofErr w:type="spellStart"/>
+      <w:r>
+        <w:rPr>
+          <w:b/>
+          <w:bCs/>
+        </w:rPr>
+        <w:t>liệu</w:t>
+      </w:r>
+      <w:proofErr w:type="spellEnd"/>
+      <w:r>
+        <w:rPr>
+          <w:b/>
+          <w:bCs/>
+        </w:rPr>
+        <w:t xml:space="preserve">: </w:t>
+      </w:r>
+      <w:r>
+        <w:rPr>
+          <w:b/>
+          <w:bCs/>
+        </w:rPr>
+        <w:t>Adventure Works 2008R2</w:t>
       </w:r>
     </w:p>
     <w:p>
@@ -263,19 +84,24 @@
         <w:spacing w:after="0" w:line="360" w:lineRule="auto"/>
         <w:jc w:val="both"/>
       </w:pPr>
+      <w:proofErr w:type="spellStart"/>
       <w:r>
         <w:rPr>
           <w:b/>
           <w:bCs/>
         </w:rPr>
-        <w:t xml:space="preserve">Cơ sở dữ liệu: </w:t>
-      </w:r>
+        <w:t>Câu</w:t>
+      </w:r>
+      <w:proofErr w:type="spellEnd"/>
       <w:r>
         <w:rPr>
           <w:b/>
           <w:bCs/>
         </w:rPr>
-        <w:t>Adventure Works 2008R2</w:t>
+        <w:t xml:space="preserve"> 1</w:t>
+      </w:r>
+      <w:r>
+        <w:t>: (LO3) (5đ)</w:t>
       </w:r>
     </w:p>
     <w:p>
@@ -283,24 +109,93 @@
         <w:spacing w:after="0" w:line="360" w:lineRule="auto"/>
         <w:jc w:val="both"/>
       </w:pPr>
-      <w:r>
-        <w:rPr>
-          <w:b/>
-          <w:bCs/>
-        </w:rPr>
-        <w:t>Câu 1</w:t>
-      </w:r>
-      <w:r>
-        <w:t>: (LO3) (5đ)</w:t>
-      </w:r>
-    </w:p>
-    <w:p>
-      <w:pPr>
-        <w:spacing w:after="0" w:line="360" w:lineRule="auto"/>
-        <w:jc w:val="both"/>
-      </w:pPr>
-      <w:r>
-        <w:t>Có 2 nhóm nhân viên với các công việc cụ thể sau:</w:t>
+      <w:proofErr w:type="spellStart"/>
+      <w:r>
+        <w:t>Có</w:t>
+      </w:r>
+      <w:proofErr w:type="spellEnd"/>
+      <w:r>
+        <w:t xml:space="preserve"> 2 </w:t>
+      </w:r>
+      <w:proofErr w:type="spellStart"/>
+      <w:r>
+        <w:t>nhóm</w:t>
+      </w:r>
+      <w:proofErr w:type="spellEnd"/>
+      <w:r>
+        <w:t xml:space="preserve"> </w:t>
+      </w:r>
+      <w:proofErr w:type="spellStart"/>
+      <w:r>
+        <w:t>nhân</w:t>
+      </w:r>
+      <w:proofErr w:type="spellEnd"/>
+      <w:r>
+        <w:t xml:space="preserve"> </w:t>
+      </w:r>
+      <w:proofErr w:type="spellStart"/>
+      <w:r>
+        <w:t>viên</w:t>
+      </w:r>
+      <w:proofErr w:type="spellEnd"/>
+      <w:r>
+        <w:t xml:space="preserve"> </w:t>
+      </w:r>
+      <w:proofErr w:type="spellStart"/>
+      <w:r>
+        <w:t>với</w:t>
+      </w:r>
+      <w:proofErr w:type="spellEnd"/>
+      <w:r>
+        <w:t xml:space="preserve"> </w:t>
+      </w:r>
+      <w:proofErr w:type="spellStart"/>
+      <w:r>
+        <w:t>các</w:t>
+      </w:r>
+      <w:proofErr w:type="spellEnd"/>
+      <w:r>
+        <w:t xml:space="preserve"> </w:t>
+      </w:r>
+      <w:proofErr w:type="spellStart"/>
+      <w:r>
+        <w:t>công</w:t>
+      </w:r>
+      <w:proofErr w:type="spellEnd"/>
+      <w:r>
+        <w:t xml:space="preserve"> </w:t>
+      </w:r>
+      <w:proofErr w:type="spellStart"/>
+      <w:r>
+        <w:t>việc</w:t>
+      </w:r>
+      <w:proofErr w:type="spellEnd"/>
+      <w:r>
+        <w:t xml:space="preserve"> </w:t>
+      </w:r>
+      <w:proofErr w:type="spellStart"/>
+      <w:r>
+        <w:t>cụ</w:t>
+      </w:r>
+      <w:proofErr w:type="spellEnd"/>
+      <w:r>
+        <w:t xml:space="preserve"> </w:t>
+      </w:r>
+      <w:proofErr w:type="spellStart"/>
+      <w:r>
+        <w:t>thể</w:t>
+      </w:r>
+      <w:proofErr w:type="spellEnd"/>
+      <w:r>
+        <w:t xml:space="preserve"> </w:t>
+      </w:r>
+      <w:proofErr w:type="spellStart"/>
+      <w:r>
+        <w:t>sau</w:t>
+      </w:r>
+      <w:proofErr w:type="spellEnd"/>
+      <w:r>
+        <w:t>:</w:t>
       </w:r>
     </w:p>
     <w:p>
@@ -313,15 +208,199 @@
         <w:spacing w:after="0" w:line="360" w:lineRule="auto"/>
         <w:jc w:val="both"/>
       </w:pPr>
-      <w:r>
-        <w:t>Nhóm nhân viên hiệu chỉnh (nhập, sửa, xóa) và xem số liệu: thuộc role NhanVien, gồm</w:t>
-      </w:r>
-      <w:r>
-        <w:t xml:space="preserve"> </w:t>
-      </w:r>
-      <w:r>
-        <w:t xml:space="preserve">nhân viên NV1 và NV2, chỉ được làm việc trên bảng </w:t>
-      </w:r>
+      <w:proofErr w:type="spellStart"/>
+      <w:r>
+        <w:t>Nhóm</w:t>
+      </w:r>
+      <w:proofErr w:type="spellEnd"/>
+      <w:r>
+        <w:t xml:space="preserve"> </w:t>
+      </w:r>
+      <w:proofErr w:type="spellStart"/>
+      <w:r>
+        <w:t>nhân</w:t>
+      </w:r>
+      <w:proofErr w:type="spellEnd"/>
+      <w:r>
+        <w:t xml:space="preserve"> </w:t>
+      </w:r>
+      <w:proofErr w:type="spellStart"/>
+      <w:r>
+        <w:t>viên</w:t>
+      </w:r>
+      <w:proofErr w:type="spellEnd"/>
+      <w:r>
+        <w:t xml:space="preserve"> </w:t>
+      </w:r>
+      <w:proofErr w:type="spellStart"/>
+      <w:r>
+        <w:t>hiệu</w:t>
+      </w:r>
+      <w:proofErr w:type="spellEnd"/>
+      <w:r>
+        <w:t xml:space="preserve"> </w:t>
+      </w:r>
+      <w:proofErr w:type="spellStart"/>
+      <w:r>
+        <w:t>chỉnh</w:t>
+      </w:r>
+      <w:proofErr w:type="spellEnd"/>
+      <w:r>
+        <w:t xml:space="preserve"> (</w:t>
+      </w:r>
+      <w:proofErr w:type="spellStart"/>
+      <w:r>
+        <w:t>nhập</w:t>
+      </w:r>
+      <w:proofErr w:type="spellEnd"/>
+      <w:r>
+        <w:t xml:space="preserve">, </w:t>
+      </w:r>
+      <w:proofErr w:type="spellStart"/>
+      <w:r>
+        <w:t>sửa</w:t>
+      </w:r>
+      <w:proofErr w:type="spellEnd"/>
+      <w:r>
+        <w:t xml:space="preserve">, </w:t>
+      </w:r>
+      <w:proofErr w:type="spellStart"/>
+      <w:r>
+        <w:t>xóa</w:t>
+      </w:r>
+      <w:proofErr w:type="spellEnd"/>
+      <w:r>
+        <w:t xml:space="preserve">) </w:t>
+      </w:r>
+      <w:proofErr w:type="spellStart"/>
+      <w:r>
+        <w:t>và</w:t>
+      </w:r>
+      <w:proofErr w:type="spellEnd"/>
+      <w:r>
+        <w:t xml:space="preserve"> </w:t>
+      </w:r>
+      <w:proofErr w:type="spellStart"/>
+      <w:r>
+        <w:t>xem</w:t>
+      </w:r>
+      <w:proofErr w:type="spellEnd"/>
+      <w:r>
+        <w:t xml:space="preserve"> </w:t>
+      </w:r>
+      <w:proofErr w:type="spellStart"/>
+      <w:r>
+        <w:t>số</w:t>
+      </w:r>
+      <w:proofErr w:type="spellEnd"/>
+      <w:r>
+        <w:t xml:space="preserve"> </w:t>
+      </w:r>
+      <w:proofErr w:type="spellStart"/>
+      <w:r>
+        <w:t>liệu</w:t>
+      </w:r>
+      <w:proofErr w:type="spellEnd"/>
+      <w:r>
+        <w:t xml:space="preserve">: </w:t>
+      </w:r>
+      <w:proofErr w:type="spellStart"/>
+      <w:r>
+        <w:t>thuộc</w:t>
+      </w:r>
+      <w:proofErr w:type="spellEnd"/>
+      <w:r>
+        <w:t xml:space="preserve"> role </w:t>
+      </w:r>
+      <w:proofErr w:type="spellStart"/>
+      <w:r>
+        <w:t>NhanVien</w:t>
+      </w:r>
+      <w:proofErr w:type="spellEnd"/>
+      <w:r>
+        <w:t xml:space="preserve">, </w:t>
+      </w:r>
+      <w:proofErr w:type="spellStart"/>
+      <w:r>
+        <w:t>gồm</w:t>
+      </w:r>
+      <w:proofErr w:type="spellEnd"/>
+      <w:r>
+        <w:t xml:space="preserve"> </w:t>
+      </w:r>
+      <w:proofErr w:type="spellStart"/>
+      <w:r>
+        <w:t>nhân</w:t>
+      </w:r>
+      <w:proofErr w:type="spellEnd"/>
+      <w:r>
+        <w:t xml:space="preserve"> </w:t>
+      </w:r>
+      <w:proofErr w:type="spellStart"/>
+      <w:r>
+        <w:t>viên</w:t>
+      </w:r>
+      <w:proofErr w:type="spellEnd"/>
+      <w:r>
+        <w:t xml:space="preserve"> NV1 </w:t>
+      </w:r>
+      <w:proofErr w:type="spellStart"/>
+      <w:r>
+        <w:t>và</w:t>
+      </w:r>
+      <w:proofErr w:type="spellEnd"/>
+      <w:r>
+        <w:t xml:space="preserve"> NV2, </w:t>
+      </w:r>
+      <w:proofErr w:type="spellStart"/>
+      <w:r>
+        <w:t>chỉ</w:t>
+      </w:r>
+      <w:proofErr w:type="spellEnd"/>
+      <w:r>
+        <w:t xml:space="preserve"> </w:t>
+      </w:r>
+      <w:proofErr w:type="spellStart"/>
+      <w:r>
+        <w:t>được</w:t>
+      </w:r>
+      <w:proofErr w:type="spellEnd"/>
+      <w:r>
+        <w:t xml:space="preserve"> </w:t>
+      </w:r>
+      <w:proofErr w:type="spellStart"/>
+      <w:r>
+        <w:t>làm</w:t>
+      </w:r>
+      <w:proofErr w:type="spellEnd"/>
+      <w:r>
+        <w:t xml:space="preserve"> </w:t>
+      </w:r>
+      <w:proofErr w:type="spellStart"/>
+      <w:r>
+        <w:t>việc</w:t>
+      </w:r>
+      <w:proofErr w:type="spellEnd"/>
+      <w:r>
+        <w:t xml:space="preserve"> </w:t>
+      </w:r>
+      <w:proofErr w:type="spellStart"/>
+      <w:r>
+        <w:t>trên</w:t>
+      </w:r>
+      <w:proofErr w:type="spellEnd"/>
+      <w:r>
+        <w:t xml:space="preserve"> </w:t>
+      </w:r>
+      <w:proofErr w:type="spellStart"/>
+      <w:r>
+        <w:t>bảng</w:t>
+      </w:r>
+      <w:proofErr w:type="spellEnd"/>
+      <w:r>
+        <w:t xml:space="preserve"> </w:t>
+      </w:r>
+      <w:proofErr w:type="spellStart"/>
       <w:r>
         <w:rPr>
           <w:i/>
@@ -329,6 +408,7 @@
         </w:rPr>
         <w:t>EmployeeDepartmentHistory</w:t>
       </w:r>
+      <w:proofErr w:type="spellEnd"/>
       <w:r>
         <w:t>.</w:t>
       </w:r>
@@ -343,29 +423,238 @@
         <w:spacing w:after="0" w:line="360" w:lineRule="auto"/>
         <w:jc w:val="both"/>
       </w:pPr>
-      <w:r>
-        <w:t>Nhân viên quản lý QL xem số liệu: thuộc role db_datareader làm việc trên bảng</w:t>
-      </w:r>
-      <w:r>
-        <w:t xml:space="preserve"> </w:t>
-      </w:r>
+      <w:proofErr w:type="spellStart"/>
+      <w:r>
+        <w:t>Nhân</w:t>
+      </w:r>
+      <w:proofErr w:type="spellEnd"/>
+      <w:r>
+        <w:t xml:space="preserve"> </w:t>
+      </w:r>
+      <w:proofErr w:type="spellStart"/>
+      <w:r>
+        <w:t>viên</w:t>
+      </w:r>
+      <w:proofErr w:type="spellEnd"/>
+      <w:r>
+        <w:t xml:space="preserve"> </w:t>
+      </w:r>
+      <w:proofErr w:type="spellStart"/>
+      <w:r>
+        <w:t>quản</w:t>
+      </w:r>
+      <w:proofErr w:type="spellEnd"/>
+      <w:r>
+        <w:t xml:space="preserve"> </w:t>
+      </w:r>
+      <w:proofErr w:type="spellStart"/>
+      <w:r>
+        <w:t>lý</w:t>
+      </w:r>
+      <w:proofErr w:type="spellEnd"/>
+      <w:r>
+        <w:t xml:space="preserve"> QL </w:t>
+      </w:r>
+      <w:proofErr w:type="spellStart"/>
+      <w:r>
+        <w:t>xem</w:t>
+      </w:r>
+      <w:proofErr w:type="spellEnd"/>
+      <w:r>
+        <w:t xml:space="preserve"> </w:t>
+      </w:r>
+      <w:proofErr w:type="spellStart"/>
+      <w:r>
+        <w:t>số</w:t>
+      </w:r>
+      <w:proofErr w:type="spellEnd"/>
+      <w:r>
+        <w:t xml:space="preserve"> </w:t>
+      </w:r>
+      <w:proofErr w:type="spellStart"/>
+      <w:r>
+        <w:t>liệu</w:t>
+      </w:r>
+      <w:proofErr w:type="spellEnd"/>
+      <w:r>
+        <w:t xml:space="preserve">: </w:t>
+      </w:r>
+      <w:proofErr w:type="spellStart"/>
+      <w:r>
+        <w:t>thuộc</w:t>
+      </w:r>
+      <w:proofErr w:type="spellEnd"/>
+      <w:r>
+        <w:t xml:space="preserve"> role </w:t>
+      </w:r>
+      <w:proofErr w:type="spellStart"/>
+      <w:r>
+        <w:t>db_datareader</w:t>
+      </w:r>
+      <w:proofErr w:type="spellEnd"/>
+      <w:r>
+        <w:t xml:space="preserve"> </w:t>
+      </w:r>
+      <w:proofErr w:type="spellStart"/>
+      <w:r>
+        <w:t>làm</w:t>
+      </w:r>
+      <w:proofErr w:type="spellEnd"/>
+      <w:r>
+        <w:t xml:space="preserve"> </w:t>
+      </w:r>
+      <w:proofErr w:type="spellStart"/>
+      <w:r>
+        <w:t>việc</w:t>
+      </w:r>
+      <w:proofErr w:type="spellEnd"/>
+      <w:r>
+        <w:t xml:space="preserve"> </w:t>
+      </w:r>
+      <w:proofErr w:type="spellStart"/>
+      <w:r>
+        <w:t>trên</w:t>
+      </w:r>
+      <w:proofErr w:type="spellEnd"/>
+      <w:r>
+        <w:t xml:space="preserve"> </w:t>
+      </w:r>
+      <w:proofErr w:type="spellStart"/>
+      <w:r>
+        <w:t>bảng</w:t>
+      </w:r>
+      <w:proofErr w:type="spellEnd"/>
+      <w:r>
+        <w:t xml:space="preserve"> </w:t>
+      </w:r>
+      <w:proofErr w:type="spellStart"/>
       <w:r>
         <w:rPr>
           <w:i/>
           <w:iCs/>
         </w:rPr>
-        <w:t xml:space="preserve">EmployeeDepartmentHistory </w:t>
-      </w:r>
-      <w:r>
-        <w:t xml:space="preserve">và bảng </w:t>
-      </w:r>
+        <w:t>EmployeeDepartmentHistory</w:t>
+      </w:r>
+      <w:proofErr w:type="spellEnd"/>
       <w:r>
         <w:rPr>
           <w:i/>
           <w:iCs/>
         </w:rPr>
-        <w:t>Department Thực hiện các yêu cầu sau</w:t>
-      </w:r>
+        <w:t xml:space="preserve"> </w:t>
+      </w:r>
+      <w:proofErr w:type="spellStart"/>
+      <w:r>
+        <w:t>và</w:t>
+      </w:r>
+      <w:proofErr w:type="spellEnd"/>
+      <w:r>
+        <w:t xml:space="preserve"> </w:t>
+      </w:r>
+      <w:proofErr w:type="spellStart"/>
+      <w:r>
+        <w:t>bảng</w:t>
+      </w:r>
+      <w:proofErr w:type="spellEnd"/>
+      <w:r>
+        <w:t xml:space="preserve"> </w:t>
+      </w:r>
+      <w:r>
+        <w:rPr>
+          <w:i/>
+          <w:iCs/>
+        </w:rPr>
+        <w:t xml:space="preserve">Department </w:t>
+      </w:r>
+      <w:proofErr w:type="spellStart"/>
+      <w:r>
+        <w:rPr>
+          <w:i/>
+          <w:iCs/>
+        </w:rPr>
+        <w:t>Thực</w:t>
+      </w:r>
+      <w:proofErr w:type="spellEnd"/>
+      <w:r>
+        <w:rPr>
+          <w:i/>
+          <w:iCs/>
+        </w:rPr>
+        <w:t xml:space="preserve"> </w:t>
+      </w:r>
+      <w:proofErr w:type="spellStart"/>
+      <w:r>
+        <w:rPr>
+          <w:i/>
+          <w:iCs/>
+        </w:rPr>
+        <w:t>hiện</w:t>
+      </w:r>
+      <w:proofErr w:type="spellEnd"/>
+      <w:r>
+        <w:rPr>
+          <w:i/>
+          <w:iCs/>
+        </w:rPr>
+        <w:t xml:space="preserve"> </w:t>
+      </w:r>
+      <w:proofErr w:type="spellStart"/>
+      <w:r>
+        <w:rPr>
+          <w:i/>
+          <w:iCs/>
+        </w:rPr>
+        <w:t>các</w:t>
+      </w:r>
+      <w:proofErr w:type="spellEnd"/>
+      <w:r>
+        <w:rPr>
+          <w:i/>
+          <w:iCs/>
+        </w:rPr>
+        <w:t xml:space="preserve"> </w:t>
+      </w:r>
+      <w:proofErr w:type="spellStart"/>
+      <w:r>
+        <w:rPr>
+          <w:i/>
+          <w:iCs/>
+        </w:rPr>
+        <w:t>yêu</w:t>
+      </w:r>
+      <w:proofErr w:type="spellEnd"/>
+      <w:r>
+        <w:rPr>
+          <w:i/>
+          <w:iCs/>
+        </w:rPr>
+        <w:t xml:space="preserve"> </w:t>
+      </w:r>
+      <w:proofErr w:type="spellStart"/>
+      <w:r>
+        <w:rPr>
+          <w:i/>
+          <w:iCs/>
+        </w:rPr>
+        <w:t>cầu</w:t>
+      </w:r>
+      <w:proofErr w:type="spellEnd"/>
+      <w:r>
+        <w:rPr>
+          <w:i/>
+          <w:iCs/>
+        </w:rPr>
+        <w:t xml:space="preserve"> </w:t>
+      </w:r>
+      <w:proofErr w:type="spellStart"/>
+      <w:r>
+        <w:rPr>
+          <w:i/>
+          <w:iCs/>
+        </w:rPr>
+        <w:t>sau</w:t>
+      </w:r>
+      <w:proofErr w:type="spellEnd"/>
       <w:r>
         <w:t>:</w:t>
       </w:r>
@@ -380,14 +669,112 @@
         <w:spacing w:after="0" w:line="360" w:lineRule="auto"/>
         <w:jc w:val="both"/>
       </w:pPr>
-      <w:r>
-        <w:t>Tạo các login; tạo các user khai thác CSDL AdventureWorks2008R2 cho các nhân viên (tên</w:t>
-      </w:r>
-      <w:r>
-        <w:t xml:space="preserve"> </w:t>
-      </w:r>
-      <w:r>
-        <w:t>login trùng tên user) (1đ).</w:t>
+      <w:proofErr w:type="spellStart"/>
+      <w:r>
+        <w:t>Tạo</w:t>
+      </w:r>
+      <w:proofErr w:type="spellEnd"/>
+      <w:r>
+        <w:t xml:space="preserve"> </w:t>
+      </w:r>
+      <w:proofErr w:type="spellStart"/>
+      <w:r>
+        <w:t>các</w:t>
+      </w:r>
+      <w:proofErr w:type="spellEnd"/>
+      <w:r>
+        <w:t xml:space="preserve"> login; </w:t>
+      </w:r>
+      <w:proofErr w:type="spellStart"/>
+      <w:r>
+        <w:t>tạo</w:t>
+      </w:r>
+      <w:proofErr w:type="spellEnd"/>
+      <w:r>
+        <w:t xml:space="preserve"> </w:t>
+      </w:r>
+      <w:proofErr w:type="spellStart"/>
+      <w:r>
+        <w:t>các</w:t>
+      </w:r>
+      <w:proofErr w:type="spellEnd"/>
+      <w:r>
+        <w:t xml:space="preserve"> user </w:t>
+      </w:r>
+      <w:proofErr w:type="spellStart"/>
+      <w:r>
+        <w:t>khai</w:t>
+      </w:r>
+      <w:proofErr w:type="spellEnd"/>
+      <w:r>
+        <w:t xml:space="preserve"> </w:t>
+      </w:r>
+      <w:proofErr w:type="spellStart"/>
+      <w:r>
+        <w:t>thác</w:t>
+      </w:r>
+      <w:proofErr w:type="spellEnd"/>
+      <w:r>
+        <w:t xml:space="preserve"> CSDL AdventureWorks2008R2 </w:t>
+      </w:r>
+      <w:proofErr w:type="spellStart"/>
+      <w:r>
+        <w:t>cho</w:t>
+      </w:r>
+      <w:proofErr w:type="spellEnd"/>
+      <w:r>
+        <w:t xml:space="preserve"> </w:t>
+      </w:r>
+      <w:proofErr w:type="spellStart"/>
+      <w:r>
+        <w:t>các</w:t>
+      </w:r>
+      <w:proofErr w:type="spellEnd"/>
+      <w:r>
+        <w:t xml:space="preserve"> </w:t>
+      </w:r>
+      <w:proofErr w:type="spellStart"/>
+      <w:r>
+        <w:t>nhân</w:t>
+      </w:r>
+      <w:proofErr w:type="spellEnd"/>
+      <w:r>
+        <w:t xml:space="preserve"> </w:t>
+      </w:r>
+      <w:proofErr w:type="spellStart"/>
+      <w:r>
+        <w:t>viên</w:t>
+      </w:r>
+      <w:proofErr w:type="spellEnd"/>
+      <w:r>
+        <w:t xml:space="preserve"> (</w:t>
+      </w:r>
+      <w:proofErr w:type="spellStart"/>
+      <w:r>
+        <w:t>tên</w:t>
+      </w:r>
+      <w:proofErr w:type="spellEnd"/>
+      <w:r>
+        <w:t xml:space="preserve"> </w:t>
+      </w:r>
+      <w:r>
+        <w:t xml:space="preserve">login </w:t>
+      </w:r>
+      <w:proofErr w:type="spellStart"/>
+      <w:r>
+        <w:t>trùng</w:t>
+      </w:r>
+      <w:proofErr w:type="spellEnd"/>
+      <w:r>
+        <w:t xml:space="preserve"> </w:t>
+      </w:r>
+      <w:proofErr w:type="spellStart"/>
+      <w:r>
+        <w:t>tên</w:t>
+      </w:r>
+      <w:proofErr w:type="spellEnd"/>
+      <w:r>
+        <w:t xml:space="preserve"> user) (1đ).</w:t>
       </w:r>
     </w:p>
     <w:p>
@@ -400,14 +787,173 @@
         <w:spacing w:after="0" w:line="360" w:lineRule="auto"/>
         <w:jc w:val="both"/>
       </w:pPr>
-      <w:r>
-        <w:t>Tạo role NhanVien, phân quyền cho role, thêm các user NV1, NV2, QL vào các role theo</w:t>
-      </w:r>
-      <w:r>
-        <w:t xml:space="preserve"> </w:t>
-      </w:r>
-      <w:r>
-        <w:t>phân công ở trên để các nhân viên hoàn thành nhiệm vụ (1đ).</w:t>
+      <w:proofErr w:type="spellStart"/>
+      <w:r>
+        <w:t>Tạo</w:t>
+      </w:r>
+      <w:proofErr w:type="spellEnd"/>
+      <w:r>
+        <w:t xml:space="preserve"> role </w:t>
+      </w:r>
+      <w:proofErr w:type="spellStart"/>
+      <w:r>
+        <w:t>NhanVien</w:t>
+      </w:r>
+      <w:proofErr w:type="spellEnd"/>
+      <w:r>
+        <w:t xml:space="preserve">, </w:t>
+      </w:r>
+      <w:proofErr w:type="spellStart"/>
+      <w:r>
+        <w:t>phân</w:t>
+      </w:r>
+      <w:proofErr w:type="spellEnd"/>
+      <w:r>
+        <w:t xml:space="preserve"> </w:t>
+      </w:r>
+      <w:proofErr w:type="spellStart"/>
+      <w:r>
+        <w:t>quyền</w:t>
+      </w:r>
+      <w:proofErr w:type="spellEnd"/>
+      <w:r>
+        <w:t xml:space="preserve"> </w:t>
+      </w:r>
+      <w:proofErr w:type="spellStart"/>
+      <w:r>
+        <w:t>cho</w:t>
+      </w:r>
+      <w:proofErr w:type="spellEnd"/>
+      <w:r>
+        <w:t xml:space="preserve"> role, </w:t>
+      </w:r>
+      <w:proofErr w:type="spellStart"/>
+      <w:r>
+        <w:t>thêm</w:t>
+      </w:r>
+      <w:proofErr w:type="spellEnd"/>
+      <w:r>
+        <w:t xml:space="preserve"> </w:t>
+      </w:r>
+      <w:proofErr w:type="spellStart"/>
+      <w:r>
+        <w:t>các</w:t>
+      </w:r>
+      <w:proofErr w:type="spellEnd"/>
+      <w:r>
+        <w:t xml:space="preserve"> user NV1, NV2, QL </w:t>
+      </w:r>
+      <w:proofErr w:type="spellStart"/>
+      <w:r>
+        <w:t>vào</w:t>
+      </w:r>
+      <w:proofErr w:type="spellEnd"/>
+      <w:r>
+        <w:t xml:space="preserve"> </w:t>
+      </w:r>
+      <w:proofErr w:type="spellStart"/>
+      <w:r>
+        <w:t>các</w:t>
+      </w:r>
+      <w:proofErr w:type="spellEnd"/>
+      <w:r>
+        <w:t xml:space="preserve"> role </w:t>
+      </w:r>
+      <w:proofErr w:type="spellStart"/>
+      <w:r>
+        <w:t>theo</w:t>
+      </w:r>
+      <w:proofErr w:type="spellEnd"/>
+      <w:r>
+        <w:t xml:space="preserve"> </w:t>
+      </w:r>
+      <w:proofErr w:type="spellStart"/>
+      <w:r>
+        <w:t>phân</w:t>
+      </w:r>
+      <w:proofErr w:type="spellEnd"/>
+      <w:r>
+        <w:t xml:space="preserve"> </w:t>
+      </w:r>
+      <w:proofErr w:type="spellStart"/>
+      <w:r>
+        <w:t>công</w:t>
+      </w:r>
+      <w:proofErr w:type="spellEnd"/>
+      <w:r>
+        <w:t xml:space="preserve"> ở </w:t>
+      </w:r>
+      <w:proofErr w:type="spellStart"/>
+      <w:r>
+        <w:t>trên</w:t>
+      </w:r>
+      <w:proofErr w:type="spellEnd"/>
+      <w:r>
+        <w:t xml:space="preserve"> </w:t>
+      </w:r>
+      <w:proofErr w:type="spellStart"/>
+      <w:r>
+        <w:t>để</w:t>
+      </w:r>
+      <w:proofErr w:type="spellEnd"/>
+      <w:r>
+        <w:t xml:space="preserve"> </w:t>
+      </w:r>
+      <w:proofErr w:type="spellStart"/>
+      <w:r>
+        <w:t>các</w:t>
+      </w:r>
+      <w:proofErr w:type="spellEnd"/>
+      <w:r>
+        <w:t xml:space="preserve"> </w:t>
+      </w:r>
+      <w:proofErr w:type="spellStart"/>
+      <w:r>
+        <w:t>nhân</w:t>
+      </w:r>
+      <w:proofErr w:type="spellEnd"/>
+      <w:r>
+        <w:t xml:space="preserve"> </w:t>
+      </w:r>
+      <w:proofErr w:type="spellStart"/>
+      <w:r>
+        <w:t>viên</w:t>
+      </w:r>
+      <w:proofErr w:type="spellEnd"/>
+      <w:r>
+        <w:t xml:space="preserve"> </w:t>
+      </w:r>
+      <w:proofErr w:type="spellStart"/>
+      <w:r>
+        <w:t>hoàn</w:t>
+      </w:r>
+      <w:proofErr w:type="spellEnd"/>
+      <w:r>
+        <w:t xml:space="preserve"> </w:t>
+      </w:r>
+      <w:proofErr w:type="spellStart"/>
+      <w:r>
+        <w:t>thành</w:t>
+      </w:r>
+      <w:proofErr w:type="spellEnd"/>
+      <w:r>
+        <w:t xml:space="preserve"> </w:t>
+      </w:r>
+      <w:proofErr w:type="spellStart"/>
+      <w:r>
+        <w:t>nhiệm</w:t>
+      </w:r>
+      <w:proofErr w:type="spellEnd"/>
+      <w:r>
+        <w:t xml:space="preserve"> </w:t>
+      </w:r>
+      <w:proofErr w:type="spellStart"/>
+      <w:r>
+        <w:t>vụ</w:t>
+      </w:r>
+      <w:proofErr w:type="spellEnd"/>
+      <w:r>
+        <w:t xml:space="preserve"> (1đ).</w:t>
       </w:r>
     </w:p>
     <w:p>
@@ -425,16 +971,203 @@
           <w:b/>
           <w:bCs/>
         </w:rPr>
-        <w:t>SV ghi chú lại Mã SV của mình</w:t>
-      </w:r>
-      <w:r>
-        <w:t>. Đăng nhập phù hợp, mở cửa sổ query tương ứng và viết</w:t>
-      </w:r>
-      <w:r>
-        <w:t xml:space="preserve"> </w:t>
-      </w:r>
-      <w:r>
-        <w:t>lệnh để:</w:t>
+        <w:t xml:space="preserve">SV </w:t>
+      </w:r>
+      <w:proofErr w:type="spellStart"/>
+      <w:r>
+        <w:rPr>
+          <w:b/>
+          <w:bCs/>
+        </w:rPr>
+        <w:t>ghi</w:t>
+      </w:r>
+      <w:proofErr w:type="spellEnd"/>
+      <w:r>
+        <w:rPr>
+          <w:b/>
+          <w:bCs/>
+        </w:rPr>
+        <w:t xml:space="preserve"> </w:t>
+      </w:r>
+      <w:proofErr w:type="spellStart"/>
+      <w:r>
+        <w:rPr>
+          <w:b/>
+          <w:bCs/>
+        </w:rPr>
+        <w:t>chú</w:t>
+      </w:r>
+      <w:proofErr w:type="spellEnd"/>
+      <w:r>
+        <w:rPr>
+          <w:b/>
+          <w:bCs/>
+        </w:rPr>
+        <w:t xml:space="preserve"> </w:t>
+      </w:r>
+      <w:proofErr w:type="spellStart"/>
+      <w:r>
+        <w:rPr>
+          <w:b/>
+          <w:bCs/>
+        </w:rPr>
+        <w:t>lại</w:t>
+      </w:r>
+      <w:proofErr w:type="spellEnd"/>
+      <w:r>
+        <w:rPr>
+          <w:b/>
+          <w:bCs/>
+        </w:rPr>
+        <w:t xml:space="preserve"> </w:t>
+      </w:r>
+      <w:proofErr w:type="spellStart"/>
+      <w:r>
+        <w:rPr>
+          <w:b/>
+          <w:bCs/>
+        </w:rPr>
+        <w:t>Mã</w:t>
+      </w:r>
+      <w:proofErr w:type="spellEnd"/>
+      <w:r>
+        <w:rPr>
+          <w:b/>
+          <w:bCs/>
+        </w:rPr>
+        <w:t xml:space="preserve"> SV </w:t>
+      </w:r>
+      <w:proofErr w:type="spellStart"/>
+      <w:r>
+        <w:rPr>
+          <w:b/>
+          <w:bCs/>
+        </w:rPr>
+        <w:t>của</w:t>
+      </w:r>
+      <w:proofErr w:type="spellEnd"/>
+      <w:r>
+        <w:rPr>
+          <w:b/>
+          <w:bCs/>
+        </w:rPr>
+        <w:t xml:space="preserve"> </w:t>
+      </w:r>
+      <w:proofErr w:type="spellStart"/>
+      <w:r>
+        <w:rPr>
+          <w:b/>
+          <w:bCs/>
+        </w:rPr>
+        <w:t>mình</w:t>
+      </w:r>
+      <w:proofErr w:type="spellEnd"/>
+      <w:r>
+        <w:t xml:space="preserve">. </w:t>
+      </w:r>
+      <w:proofErr w:type="spellStart"/>
+      <w:r>
+        <w:t>Đăng</w:t>
+      </w:r>
+      <w:proofErr w:type="spellEnd"/>
+      <w:r>
+        <w:t xml:space="preserve"> </w:t>
+      </w:r>
+      <w:proofErr w:type="spellStart"/>
+      <w:r>
+        <w:t>nhập</w:t>
+      </w:r>
+      <w:proofErr w:type="spellEnd"/>
+      <w:r>
+        <w:t xml:space="preserve"> </w:t>
+      </w:r>
+      <w:proofErr w:type="spellStart"/>
+      <w:r>
+        <w:t>phù</w:t>
+      </w:r>
+      <w:proofErr w:type="spellEnd"/>
+      <w:r>
+        <w:t xml:space="preserve"> </w:t>
+      </w:r>
+      <w:proofErr w:type="spellStart"/>
+      <w:r>
+        <w:t>hợp</w:t>
+      </w:r>
+      <w:proofErr w:type="spellEnd"/>
+      <w:r>
+        <w:t xml:space="preserve">, </w:t>
+      </w:r>
+      <w:proofErr w:type="spellStart"/>
+      <w:r>
+        <w:t>mở</w:t>
+      </w:r>
+      <w:proofErr w:type="spellEnd"/>
+      <w:r>
+        <w:t xml:space="preserve"> </w:t>
+      </w:r>
+      <w:proofErr w:type="spellStart"/>
+      <w:r>
+        <w:t>cửa</w:t>
+      </w:r>
+      <w:proofErr w:type="spellEnd"/>
+      <w:r>
+        <w:t xml:space="preserve"> </w:t>
+      </w:r>
+      <w:proofErr w:type="spellStart"/>
+      <w:r>
+        <w:t>sổ</w:t>
+      </w:r>
+      <w:proofErr w:type="spellEnd"/>
+      <w:r>
+        <w:t xml:space="preserve"> query </w:t>
+      </w:r>
+      <w:proofErr w:type="spellStart"/>
+      <w:r>
+        <w:t>tương</w:t>
+      </w:r>
+      <w:proofErr w:type="spellEnd"/>
+      <w:r>
+        <w:t xml:space="preserve"> </w:t>
+      </w:r>
+      <w:proofErr w:type="spellStart"/>
+      <w:r>
+        <w:t>ứng</w:t>
+      </w:r>
+      <w:proofErr w:type="spellEnd"/>
+      <w:r>
+        <w:t xml:space="preserve"> </w:t>
+      </w:r>
+      <w:proofErr w:type="spellStart"/>
+      <w:r>
+        <w:t>và</w:t>
+      </w:r>
+      <w:proofErr w:type="spellEnd"/>
+      <w:r>
+        <w:t xml:space="preserve"> </w:t>
+      </w:r>
+      <w:proofErr w:type="spellStart"/>
+      <w:r>
+        <w:t>viết</w:t>
+      </w:r>
+      <w:proofErr w:type="spellEnd"/>
+      <w:r>
+        <w:t xml:space="preserve"> </w:t>
+      </w:r>
+      <w:proofErr w:type="spellStart"/>
+      <w:r>
+        <w:t>lệnh</w:t>
+      </w:r>
+      <w:proofErr w:type="spellEnd"/>
+      <w:r>
+        <w:t xml:space="preserve"> </w:t>
+      </w:r>
+      <w:proofErr w:type="spellStart"/>
+      <w:r>
+        <w:t>để</w:t>
+      </w:r>
+      <w:proofErr w:type="spellEnd"/>
+      <w:r>
+        <w:t>:</w:t>
       </w:r>
     </w:p>
     <w:p>
@@ -447,9 +1180,63 @@
         <w:spacing w:after="0" w:line="360" w:lineRule="auto"/>
         <w:jc w:val="both"/>
       </w:pPr>
-      <w:r>
-        <w:t xml:space="preserve">Nhân viên NV1 sửa ModifiedDate của người có </w:t>
-      </w:r>
+      <w:proofErr w:type="spellStart"/>
+      <w:r>
+        <w:t>Nhân</w:t>
+      </w:r>
+      <w:proofErr w:type="spellEnd"/>
+      <w:r>
+        <w:t xml:space="preserve"> </w:t>
+      </w:r>
+      <w:proofErr w:type="spellStart"/>
+      <w:r>
+        <w:t>viên</w:t>
+      </w:r>
+      <w:proofErr w:type="spellEnd"/>
+      <w:r>
+        <w:t xml:space="preserve"> NV1 </w:t>
+      </w:r>
+      <w:proofErr w:type="spellStart"/>
+      <w:r>
+        <w:t>sửa</w:t>
+      </w:r>
+      <w:proofErr w:type="spellEnd"/>
+      <w:r>
+        <w:t xml:space="preserve"> </w:t>
+      </w:r>
+      <w:proofErr w:type="spellStart"/>
+      <w:r>
+        <w:t>ModifiedDate</w:t>
+      </w:r>
+      <w:proofErr w:type="spellEnd"/>
+      <w:r>
+        <w:t xml:space="preserve"> </w:t>
+      </w:r>
+      <w:proofErr w:type="spellStart"/>
+      <w:r>
+        <w:t>của</w:t>
+      </w:r>
+      <w:proofErr w:type="spellEnd"/>
+      <w:r>
+        <w:t xml:space="preserve"> </w:t>
+      </w:r>
+      <w:proofErr w:type="spellStart"/>
+      <w:r>
+        <w:t>người</w:t>
+      </w:r>
+      <w:proofErr w:type="spellEnd"/>
+      <w:r>
+        <w:t xml:space="preserve"> </w:t>
+      </w:r>
+      <w:proofErr w:type="spellStart"/>
+      <w:r>
+        <w:t>có</w:t>
+      </w:r>
+      <w:proofErr w:type="spellEnd"/>
+      <w:r>
+        <w:t xml:space="preserve"> </w:t>
+      </w:r>
+      <w:proofErr w:type="spellStart"/>
       <w:r>
         <w:rPr>
           <w:i/>
@@ -457,18 +1244,179 @@
         </w:rPr>
         <w:t>BusinessEntityID</w:t>
       </w:r>
+      <w:proofErr w:type="spellEnd"/>
+      <w:proofErr w:type="gramStart"/>
       <w:r>
         <w:t>=(</w:t>
       </w:r>
+      <w:proofErr w:type="gramEnd"/>
       <w:r>
         <w:rPr>
           <w:i/>
           <w:iCs/>
         </w:rPr>
-        <w:t>2 ký tự cuối của Mã SV của chính SV dự thi</w:t>
-      </w:r>
-      <w:r>
-        <w:t>) thành getdate()</w:t>
+        <w:t xml:space="preserve">2 </w:t>
+      </w:r>
+      <w:proofErr w:type="spellStart"/>
+      <w:r>
+        <w:rPr>
+          <w:i/>
+          <w:iCs/>
+        </w:rPr>
+        <w:t>ký</w:t>
+      </w:r>
+      <w:proofErr w:type="spellEnd"/>
+      <w:r>
+        <w:rPr>
+          <w:i/>
+          <w:iCs/>
+        </w:rPr>
+        <w:t xml:space="preserve"> </w:t>
+      </w:r>
+      <w:proofErr w:type="spellStart"/>
+      <w:r>
+        <w:rPr>
+          <w:i/>
+          <w:iCs/>
+        </w:rPr>
+        <w:t>tự</w:t>
+      </w:r>
+      <w:proofErr w:type="spellEnd"/>
+      <w:r>
+        <w:rPr>
+          <w:i/>
+          <w:iCs/>
+        </w:rPr>
+        <w:t xml:space="preserve"> </w:t>
+      </w:r>
+      <w:proofErr w:type="spellStart"/>
+      <w:r>
+        <w:rPr>
+          <w:i/>
+          <w:iCs/>
+        </w:rPr>
+        <w:t>cuối</w:t>
+      </w:r>
+      <w:proofErr w:type="spellEnd"/>
+      <w:r>
+        <w:rPr>
+          <w:i/>
+          <w:iCs/>
+        </w:rPr>
+        <w:t xml:space="preserve"> </w:t>
+      </w:r>
+      <w:proofErr w:type="spellStart"/>
+      <w:r>
+        <w:rPr>
+          <w:i/>
+          <w:iCs/>
+        </w:rPr>
+        <w:t>của</w:t>
+      </w:r>
+      <w:proofErr w:type="spellEnd"/>
+      <w:r>
+        <w:rPr>
+          <w:i/>
+          <w:iCs/>
+        </w:rPr>
+        <w:t xml:space="preserve"> </w:t>
+      </w:r>
+      <w:proofErr w:type="spellStart"/>
+      <w:r>
+        <w:rPr>
+          <w:i/>
+          <w:iCs/>
+        </w:rPr>
+        <w:t>Mã</w:t>
+      </w:r>
+      <w:proofErr w:type="spellEnd"/>
+      <w:r>
+        <w:rPr>
+          <w:i/>
+          <w:iCs/>
+        </w:rPr>
+        <w:t xml:space="preserve"> SV </w:t>
+      </w:r>
+      <w:proofErr w:type="spellStart"/>
+      <w:r>
+        <w:rPr>
+          <w:i/>
+          <w:iCs/>
+        </w:rPr>
+        <w:t>của</w:t>
+      </w:r>
+      <w:proofErr w:type="spellEnd"/>
+      <w:r>
+        <w:rPr>
+          <w:i/>
+          <w:iCs/>
+        </w:rPr>
+        <w:t xml:space="preserve"> </w:t>
+      </w:r>
+      <w:proofErr w:type="spellStart"/>
+      <w:r>
+        <w:rPr>
+          <w:i/>
+          <w:iCs/>
+        </w:rPr>
+        <w:t>chính</w:t>
+      </w:r>
+      <w:proofErr w:type="spellEnd"/>
+      <w:r>
+        <w:rPr>
+          <w:i/>
+          <w:iCs/>
+        </w:rPr>
+        <w:t xml:space="preserve"> SV </w:t>
+      </w:r>
+      <w:proofErr w:type="spellStart"/>
+      <w:r>
+        <w:rPr>
+          <w:i/>
+          <w:iCs/>
+        </w:rPr>
+        <w:t>dự</w:t>
+      </w:r>
+      <w:proofErr w:type="spellEnd"/>
+      <w:r>
+        <w:rPr>
+          <w:i/>
+          <w:iCs/>
+        </w:rPr>
+        <w:t xml:space="preserve"> </w:t>
+      </w:r>
+      <w:proofErr w:type="spellStart"/>
+      <w:r>
+        <w:rPr>
+          <w:i/>
+          <w:iCs/>
+        </w:rPr>
+        <w:t>thi</w:t>
+      </w:r>
+      <w:proofErr w:type="spellEnd"/>
+      <w:r>
+        <w:t xml:space="preserve">) </w:t>
+      </w:r>
+      <w:proofErr w:type="spellStart"/>
+      <w:r>
+        <w:t>thành</w:t>
+      </w:r>
+      <w:proofErr w:type="spellEnd"/>
+      <w:r>
+        <w:t xml:space="preserve"> </w:t>
+      </w:r>
+      <w:proofErr w:type="spellStart"/>
+      <w:proofErr w:type="gramStart"/>
+      <w:r>
+        <w:t>getdate</w:t>
+      </w:r>
+      <w:proofErr w:type="spellEnd"/>
+      <w:r>
+        <w:t>(</w:t>
+      </w:r>
+      <w:proofErr w:type="gramEnd"/>
+      <w:r>
+        <w:t>)</w:t>
       </w:r>
     </w:p>
     <w:p>
@@ -481,9 +1429,71 @@
         <w:spacing w:after="0" w:line="360" w:lineRule="auto"/>
         <w:jc w:val="both"/>
       </w:pPr>
-      <w:r>
-        <w:t xml:space="preserve">Nhân viên NV2 xóa dữ liệu của người có </w:t>
-      </w:r>
+      <w:proofErr w:type="spellStart"/>
+      <w:r>
+        <w:t>Nhân</w:t>
+      </w:r>
+      <w:proofErr w:type="spellEnd"/>
+      <w:r>
+        <w:t xml:space="preserve"> </w:t>
+      </w:r>
+      <w:proofErr w:type="spellStart"/>
+      <w:r>
+        <w:t>viên</w:t>
+      </w:r>
+      <w:proofErr w:type="spellEnd"/>
+      <w:r>
+        <w:t xml:space="preserve"> NV2 </w:t>
+      </w:r>
+      <w:proofErr w:type="spellStart"/>
+      <w:r>
+        <w:t>xóa</w:t>
+      </w:r>
+      <w:proofErr w:type="spellEnd"/>
+      <w:r>
+        <w:t xml:space="preserve"> </w:t>
+      </w:r>
+      <w:proofErr w:type="spellStart"/>
+      <w:r>
+        <w:t>dữ</w:t>
+      </w:r>
+      <w:proofErr w:type="spellEnd"/>
+      <w:r>
+        <w:t xml:space="preserve"> </w:t>
+      </w:r>
+      <w:proofErr w:type="spellStart"/>
+      <w:r>
+        <w:t>liệu</w:t>
+      </w:r>
+      <w:proofErr w:type="spellEnd"/>
+      <w:r>
+        <w:t xml:space="preserve"> </w:t>
+      </w:r>
+      <w:proofErr w:type="spellStart"/>
+      <w:r>
+        <w:t>của</w:t>
+      </w:r>
+      <w:proofErr w:type="spellEnd"/>
+      <w:r>
+        <w:t xml:space="preserve"> </w:t>
+      </w:r>
+      <w:proofErr w:type="spellStart"/>
+      <w:r>
+        <w:t>người</w:t>
+      </w:r>
+      <w:proofErr w:type="spellEnd"/>
+      <w:r>
+        <w:t xml:space="preserve"> </w:t>
+      </w:r>
+      <w:proofErr w:type="spellStart"/>
+      <w:r>
+        <w:t>có</w:t>
+      </w:r>
+      <w:proofErr w:type="spellEnd"/>
+      <w:r>
+        <w:t xml:space="preserve"> </w:t>
+      </w:r>
+      <w:proofErr w:type="spellStart"/>
       <w:r>
         <w:rPr>
           <w:i/>
@@ -491,16 +1501,156 @@
         </w:rPr>
         <w:t>BusinessEntityID</w:t>
       </w:r>
+      <w:proofErr w:type="spellEnd"/>
+      <w:proofErr w:type="gramStart"/>
       <w:r>
         <w:t>=(</w:t>
       </w:r>
+      <w:proofErr w:type="gramEnd"/>
       <w:r>
         <w:rPr>
           <w:i/>
           <w:iCs/>
         </w:rPr>
-        <w:t>2 ký tự đầu của Mã SV của chính SV dự thi</w:t>
-      </w:r>
+        <w:t xml:space="preserve">2 </w:t>
+      </w:r>
+      <w:proofErr w:type="spellStart"/>
+      <w:r>
+        <w:rPr>
+          <w:i/>
+          <w:iCs/>
+        </w:rPr>
+        <w:t>ký</w:t>
+      </w:r>
+      <w:proofErr w:type="spellEnd"/>
+      <w:r>
+        <w:rPr>
+          <w:i/>
+          <w:iCs/>
+        </w:rPr>
+        <w:t xml:space="preserve"> </w:t>
+      </w:r>
+      <w:proofErr w:type="spellStart"/>
+      <w:r>
+        <w:rPr>
+          <w:i/>
+          <w:iCs/>
+        </w:rPr>
+        <w:t>tự</w:t>
+      </w:r>
+      <w:proofErr w:type="spellEnd"/>
+      <w:r>
+        <w:rPr>
+          <w:i/>
+          <w:iCs/>
+        </w:rPr>
+        <w:t xml:space="preserve"> </w:t>
+      </w:r>
+      <w:proofErr w:type="spellStart"/>
+      <w:r>
+        <w:rPr>
+          <w:i/>
+          <w:iCs/>
+        </w:rPr>
+        <w:t>đầu</w:t>
+      </w:r>
+      <w:proofErr w:type="spellEnd"/>
+      <w:r>
+        <w:rPr>
+          <w:i/>
+          <w:iCs/>
+        </w:rPr>
+        <w:t xml:space="preserve"> </w:t>
+      </w:r>
+      <w:proofErr w:type="spellStart"/>
+      <w:r>
+        <w:rPr>
+          <w:i/>
+          <w:iCs/>
+        </w:rPr>
+        <w:t>của</w:t>
+      </w:r>
+      <w:proofErr w:type="spellEnd"/>
+      <w:r>
+        <w:rPr>
+          <w:i/>
+          <w:iCs/>
+        </w:rPr>
+        <w:t xml:space="preserve"> </w:t>
+      </w:r>
+      <w:proofErr w:type="spellStart"/>
+      <w:r>
+        <w:rPr>
+          <w:i/>
+          <w:iCs/>
+        </w:rPr>
+        <w:t>Mã</w:t>
+      </w:r>
+      <w:proofErr w:type="spellEnd"/>
+      <w:r>
+        <w:rPr>
+          <w:i/>
+          <w:iCs/>
+        </w:rPr>
+        <w:t xml:space="preserve"> SV </w:t>
+      </w:r>
+      <w:proofErr w:type="spellStart"/>
+      <w:r>
+        <w:rPr>
+          <w:i/>
+          <w:iCs/>
+        </w:rPr>
+        <w:t>của</w:t>
+      </w:r>
+      <w:proofErr w:type="spellEnd"/>
+      <w:r>
+        <w:rPr>
+          <w:i/>
+          <w:iCs/>
+        </w:rPr>
+        <w:t xml:space="preserve"> </w:t>
+      </w:r>
+      <w:proofErr w:type="spellStart"/>
+      <w:r>
+        <w:rPr>
+          <w:i/>
+          <w:iCs/>
+        </w:rPr>
+        <w:t>chính</w:t>
+      </w:r>
+      <w:proofErr w:type="spellEnd"/>
+      <w:r>
+        <w:rPr>
+          <w:i/>
+          <w:iCs/>
+        </w:rPr>
+        <w:t xml:space="preserve"> SV </w:t>
+      </w:r>
+      <w:proofErr w:type="spellStart"/>
+      <w:r>
+        <w:rPr>
+          <w:i/>
+          <w:iCs/>
+        </w:rPr>
+        <w:t>dự</w:t>
+      </w:r>
+      <w:proofErr w:type="spellEnd"/>
+      <w:r>
+        <w:rPr>
+          <w:i/>
+          <w:iCs/>
+        </w:rPr>
+        <w:t xml:space="preserve"> </w:t>
+      </w:r>
+      <w:proofErr w:type="spellStart"/>
+      <w:r>
+        <w:rPr>
+          <w:i/>
+          <w:iCs/>
+        </w:rPr>
+        <w:t>thi</w:t>
+      </w:r>
+      <w:proofErr w:type="spellEnd"/>
       <w:r>
         <w:t>).</w:t>
       </w:r>
@@ -516,8 +1666,141 @@
         <w:jc w:val="both"/>
       </w:pPr>
       <w:r>
-        <w:t>Sau cùng, nhân viên QL xem lại kết quả NV1 và NV2 đã làm ***Nhớ chụp hình cửa sổ query của 3 user trên</w:t>
-      </w:r>
+        <w:t xml:space="preserve">Sau </w:t>
+      </w:r>
+      <w:proofErr w:type="spellStart"/>
+      <w:r>
+        <w:t>cùng</w:t>
+      </w:r>
+      <w:proofErr w:type="spellEnd"/>
+      <w:r>
+        <w:t xml:space="preserve">, </w:t>
+      </w:r>
+      <w:proofErr w:type="spellStart"/>
+      <w:r>
+        <w:t>nhân</w:t>
+      </w:r>
+      <w:proofErr w:type="spellEnd"/>
+      <w:r>
+        <w:t xml:space="preserve"> </w:t>
+      </w:r>
+      <w:proofErr w:type="spellStart"/>
+      <w:r>
+        <w:t>viên</w:t>
+      </w:r>
+      <w:proofErr w:type="spellEnd"/>
+      <w:r>
+        <w:t xml:space="preserve"> QL </w:t>
+      </w:r>
+      <w:proofErr w:type="spellStart"/>
+      <w:r>
+        <w:t>xem</w:t>
+      </w:r>
+      <w:proofErr w:type="spellEnd"/>
+      <w:r>
+        <w:t xml:space="preserve"> </w:t>
+      </w:r>
+      <w:proofErr w:type="spellStart"/>
+      <w:r>
+        <w:t>lại</w:t>
+      </w:r>
+      <w:proofErr w:type="spellEnd"/>
+      <w:r>
+        <w:t xml:space="preserve"> </w:t>
+      </w:r>
+      <w:proofErr w:type="spellStart"/>
+      <w:r>
+        <w:t>kết</w:t>
+      </w:r>
+      <w:proofErr w:type="spellEnd"/>
+      <w:r>
+        <w:t xml:space="preserve"> </w:t>
+      </w:r>
+      <w:proofErr w:type="spellStart"/>
+      <w:r>
+        <w:t>quả</w:t>
+      </w:r>
+      <w:proofErr w:type="spellEnd"/>
+      <w:r>
+        <w:t xml:space="preserve"> NV1 </w:t>
+      </w:r>
+      <w:proofErr w:type="spellStart"/>
+      <w:r>
+        <w:t>và</w:t>
+      </w:r>
+      <w:proofErr w:type="spellEnd"/>
+      <w:r>
+        <w:t xml:space="preserve"> NV2 </w:t>
+      </w:r>
+      <w:proofErr w:type="spellStart"/>
+      <w:r>
+        <w:t>đã</w:t>
+      </w:r>
+      <w:proofErr w:type="spellEnd"/>
+      <w:r>
+        <w:t xml:space="preserve"> </w:t>
+      </w:r>
+      <w:proofErr w:type="spellStart"/>
+      <w:r>
+        <w:t>làm</w:t>
+      </w:r>
+      <w:proofErr w:type="spellEnd"/>
+      <w:r>
+        <w:t xml:space="preserve"> ***</w:t>
+      </w:r>
+      <w:proofErr w:type="spellStart"/>
+      <w:r>
+        <w:t>Nhớ</w:t>
+      </w:r>
+      <w:proofErr w:type="spellEnd"/>
+      <w:r>
+        <w:t xml:space="preserve"> </w:t>
+      </w:r>
+      <w:proofErr w:type="spellStart"/>
+      <w:r>
+        <w:t>chụp</w:t>
+      </w:r>
+      <w:proofErr w:type="spellEnd"/>
+      <w:r>
+        <w:t xml:space="preserve"> </w:t>
+      </w:r>
+      <w:proofErr w:type="spellStart"/>
+      <w:r>
+        <w:t>hình</w:t>
+      </w:r>
+      <w:proofErr w:type="spellEnd"/>
+      <w:r>
+        <w:t xml:space="preserve"> </w:t>
+      </w:r>
+      <w:proofErr w:type="spellStart"/>
+      <w:r>
+        <w:t>cửa</w:t>
+      </w:r>
+      <w:proofErr w:type="spellEnd"/>
+      <w:r>
+        <w:t xml:space="preserve"> </w:t>
+      </w:r>
+      <w:proofErr w:type="spellStart"/>
+      <w:r>
+        <w:t>sổ</w:t>
+      </w:r>
+      <w:proofErr w:type="spellEnd"/>
+      <w:r>
+        <w:t xml:space="preserve"> query </w:t>
+      </w:r>
+      <w:proofErr w:type="spellStart"/>
+      <w:r>
+        <w:t>của</w:t>
+      </w:r>
+      <w:proofErr w:type="spellEnd"/>
+      <w:r>
+        <w:t xml:space="preserve"> 3 user </w:t>
+      </w:r>
+      <w:proofErr w:type="spellStart"/>
+      <w:r>
+        <w:t>trên</w:t>
+      </w:r>
+      <w:proofErr w:type="spellEnd"/>
     </w:p>
     <w:p>
       <w:pPr>
@@ -539,8 +1822,181 @@
         </w:rPr>
         <w:t xml:space="preserve">Lưu ý: </w:t>
       </w:r>
-      <w:r>
-        <w:t>Đặt tên các cửa sổ query làm việc ứng với các nhân viên là NV1, NV2, QL và lưu các query này vào thư mục bài làm) (1đ).</w:t>
+      <w:proofErr w:type="spellStart"/>
+      <w:r>
+        <w:t>Đặt</w:t>
+      </w:r>
+      <w:proofErr w:type="spellEnd"/>
+      <w:r>
+        <w:t xml:space="preserve"> </w:t>
+      </w:r>
+      <w:proofErr w:type="spellStart"/>
+      <w:r>
+        <w:t>tên</w:t>
+      </w:r>
+      <w:proofErr w:type="spellEnd"/>
+      <w:r>
+        <w:t xml:space="preserve"> </w:t>
+      </w:r>
+      <w:proofErr w:type="spellStart"/>
+      <w:r>
+        <w:t>các</w:t>
+      </w:r>
+      <w:proofErr w:type="spellEnd"/>
+      <w:r>
+        <w:t xml:space="preserve"> </w:t>
+      </w:r>
+      <w:proofErr w:type="spellStart"/>
+      <w:r>
+        <w:t>cửa</w:t>
+      </w:r>
+      <w:proofErr w:type="spellEnd"/>
+      <w:r>
+        <w:t xml:space="preserve"> </w:t>
+      </w:r>
+      <w:proofErr w:type="spellStart"/>
+      <w:r>
+        <w:t>sổ</w:t>
+      </w:r>
+      <w:proofErr w:type="spellEnd"/>
+      <w:r>
+        <w:t xml:space="preserve"> query </w:t>
+      </w:r>
+      <w:proofErr w:type="spellStart"/>
+      <w:r>
+        <w:t>làm</w:t>
+      </w:r>
+      <w:proofErr w:type="spellEnd"/>
+      <w:r>
+        <w:t xml:space="preserve"> </w:t>
+      </w:r>
+      <w:proofErr w:type="spellStart"/>
+      <w:r>
+        <w:t>việc</w:t>
+      </w:r>
+      <w:proofErr w:type="spellEnd"/>
+      <w:r>
+        <w:t xml:space="preserve"> </w:t>
+      </w:r>
+      <w:proofErr w:type="spellStart"/>
+      <w:r>
+        <w:t>ứng</w:t>
+      </w:r>
+      <w:proofErr w:type="spellEnd"/>
+      <w:r>
+        <w:t xml:space="preserve"> </w:t>
+      </w:r>
+      <w:proofErr w:type="spellStart"/>
+      <w:r>
+        <w:t>với</w:t>
+      </w:r>
+      <w:proofErr w:type="spellEnd"/>
+      <w:r>
+        <w:t xml:space="preserve"> </w:t>
+      </w:r>
+      <w:proofErr w:type="spellStart"/>
+      <w:r>
+        <w:t>các</w:t>
+      </w:r>
+      <w:proofErr w:type="spellEnd"/>
+      <w:r>
+        <w:t xml:space="preserve"> </w:t>
+      </w:r>
+      <w:proofErr w:type="spellStart"/>
+      <w:r>
+        <w:t>nhân</w:t>
+      </w:r>
+      <w:proofErr w:type="spellEnd"/>
+      <w:r>
+        <w:t xml:space="preserve"> </w:t>
+      </w:r>
+      <w:proofErr w:type="spellStart"/>
+      <w:r>
+        <w:t>viên</w:t>
+      </w:r>
+      <w:proofErr w:type="spellEnd"/>
+      <w:r>
+        <w:t xml:space="preserve"> </w:t>
+      </w:r>
+      <w:proofErr w:type="spellStart"/>
+      <w:r>
+        <w:t>là</w:t>
+      </w:r>
+      <w:proofErr w:type="spellEnd"/>
+      <w:r>
+        <w:t xml:space="preserve"> NV1, NV2, QL </w:t>
+      </w:r>
+      <w:proofErr w:type="spellStart"/>
+      <w:r>
+        <w:t>và</w:t>
+      </w:r>
+      <w:proofErr w:type="spellEnd"/>
+      <w:r>
+        <w:t xml:space="preserve"> </w:t>
+      </w:r>
+      <w:proofErr w:type="spellStart"/>
+      <w:r>
+        <w:t>lưu</w:t>
+      </w:r>
+      <w:proofErr w:type="spellEnd"/>
+      <w:r>
+        <w:t xml:space="preserve"> </w:t>
+      </w:r>
+      <w:proofErr w:type="spellStart"/>
+      <w:r>
+        <w:t>các</w:t>
+      </w:r>
+      <w:proofErr w:type="spellEnd"/>
+      <w:r>
+        <w:t xml:space="preserve"> query </w:t>
+      </w:r>
+      <w:proofErr w:type="spellStart"/>
+      <w:r>
+        <w:t>này</w:t>
+      </w:r>
+      <w:proofErr w:type="spellEnd"/>
+      <w:r>
+        <w:t xml:space="preserve"> </w:t>
+      </w:r>
+      <w:proofErr w:type="spellStart"/>
+      <w:r>
+        <w:t>vào</w:t>
+      </w:r>
+      <w:proofErr w:type="spellEnd"/>
+      <w:r>
+        <w:t xml:space="preserve"> </w:t>
+      </w:r>
+      <w:proofErr w:type="spellStart"/>
+      <w:r>
+        <w:t>thư</w:t>
+      </w:r>
+      <w:proofErr w:type="spellEnd"/>
+      <w:r>
+        <w:t xml:space="preserve"> </w:t>
+      </w:r>
+      <w:proofErr w:type="spellStart"/>
+      <w:r>
+        <w:t>mục</w:t>
+      </w:r>
+      <w:proofErr w:type="spellEnd"/>
+      <w:r>
+        <w:t xml:space="preserve"> </w:t>
+      </w:r>
+      <w:proofErr w:type="spellStart"/>
+      <w:r>
+        <w:t>bài</w:t>
+      </w:r>
+      <w:proofErr w:type="spellEnd"/>
+      <w:r>
+        <w:t xml:space="preserve"> </w:t>
+      </w:r>
+      <w:proofErr w:type="spellStart"/>
+      <w:r>
+        <w:t>làm</w:t>
+      </w:r>
+      <w:proofErr w:type="spellEnd"/>
+      <w:r>
+        <w:t>) (1đ).</w:t>
       </w:r>
     </w:p>
     <w:p>
@@ -554,13 +2010,167 @@
         <w:jc w:val="both"/>
       </w:pPr>
       <w:r>
-        <w:t>Ai có thể xem dữ liệu bảng HumanResources.Employee? Giải thích. Viết lệnh kiểm tra</w:t>
-      </w:r>
-      <w:r>
-        <w:t xml:space="preserve"> </w:t>
-      </w:r>
-      <w:r>
-        <w:t>quyền trên cửa sổ query của user tương ứng (1đ).</w:t>
+        <w:t xml:space="preserve">Ai </w:t>
+      </w:r>
+      <w:proofErr w:type="spellStart"/>
+      <w:r>
+        <w:t>có</w:t>
+      </w:r>
+      <w:proofErr w:type="spellEnd"/>
+      <w:r>
+        <w:t xml:space="preserve"> </w:t>
+      </w:r>
+      <w:proofErr w:type="spellStart"/>
+      <w:r>
+        <w:t>thể</w:t>
+      </w:r>
+      <w:proofErr w:type="spellEnd"/>
+      <w:r>
+        <w:t xml:space="preserve"> </w:t>
+      </w:r>
+      <w:proofErr w:type="spellStart"/>
+      <w:r>
+        <w:t>xem</w:t>
+      </w:r>
+      <w:proofErr w:type="spellEnd"/>
+      <w:r>
+        <w:t xml:space="preserve"> </w:t>
+      </w:r>
+      <w:proofErr w:type="spellStart"/>
+      <w:r>
+        <w:t>dữ</w:t>
+      </w:r>
+      <w:proofErr w:type="spellEnd"/>
+      <w:r>
+        <w:t xml:space="preserve"> </w:t>
+      </w:r>
+      <w:proofErr w:type="spellStart"/>
+      <w:r>
+        <w:t>liệu</w:t>
+      </w:r>
+      <w:proofErr w:type="spellEnd"/>
+      <w:r>
+        <w:t xml:space="preserve"> </w:t>
+      </w:r>
+      <w:proofErr w:type="spellStart"/>
+      <w:r>
+        <w:t>bảng</w:t>
+      </w:r>
+      <w:proofErr w:type="spellEnd"/>
+      <w:r>
+        <w:t xml:space="preserve"> </w:t>
+      </w:r>
+      <w:proofErr w:type="spellStart"/>
+      <w:r>
+        <w:t>HumanResources.Employee</w:t>
+      </w:r>
+      <w:proofErr w:type="spellEnd"/>
+      <w:r>
+        <w:t xml:space="preserve">? </w:t>
+      </w:r>
+      <w:proofErr w:type="spellStart"/>
+      <w:r>
+        <w:t>Giải</w:t>
+      </w:r>
+      <w:proofErr w:type="spellEnd"/>
+      <w:r>
+        <w:t xml:space="preserve"> </w:t>
+      </w:r>
+      <w:proofErr w:type="spellStart"/>
+      <w:r>
+        <w:t>thích</w:t>
+      </w:r>
+      <w:proofErr w:type="spellEnd"/>
+      <w:r>
+        <w:t xml:space="preserve">. </w:t>
+      </w:r>
+      <w:proofErr w:type="spellStart"/>
+      <w:r>
+        <w:t>Viết</w:t>
+      </w:r>
+      <w:proofErr w:type="spellEnd"/>
+      <w:r>
+        <w:t xml:space="preserve"> </w:t>
+      </w:r>
+      <w:proofErr w:type="spellStart"/>
+      <w:r>
+        <w:t>lệnh</w:t>
+      </w:r>
+      <w:proofErr w:type="spellEnd"/>
+      <w:r>
+        <w:t xml:space="preserve"> </w:t>
+      </w:r>
+      <w:proofErr w:type="spellStart"/>
+      <w:r>
+        <w:t>kiểm</w:t>
+      </w:r>
+      <w:proofErr w:type="spellEnd"/>
+      <w:r>
+        <w:t xml:space="preserve"> </w:t>
+      </w:r>
+      <w:proofErr w:type="spellStart"/>
+      <w:r>
+        <w:t>tra</w:t>
+      </w:r>
+      <w:proofErr w:type="spellEnd"/>
+      <w:r>
+        <w:t xml:space="preserve"> </w:t>
+      </w:r>
+      <w:proofErr w:type="spellStart"/>
+      <w:r>
+        <w:t>quyền</w:t>
+      </w:r>
+      <w:proofErr w:type="spellEnd"/>
+      <w:r>
+        <w:t xml:space="preserve"> </w:t>
+      </w:r>
+      <w:proofErr w:type="spellStart"/>
+      <w:r>
+        <w:t>trên</w:t>
+      </w:r>
+      <w:proofErr w:type="spellEnd"/>
+      <w:r>
+        <w:t xml:space="preserve"> </w:t>
+      </w:r>
+      <w:proofErr w:type="spellStart"/>
+      <w:r>
+        <w:t>cửa</w:t>
+      </w:r>
+      <w:proofErr w:type="spellEnd"/>
+      <w:r>
+        <w:t xml:space="preserve"> </w:t>
+      </w:r>
+      <w:proofErr w:type="spellStart"/>
+      <w:r>
+        <w:t>sổ</w:t>
+      </w:r>
+      <w:proofErr w:type="spellEnd"/>
+      <w:r>
+        <w:t xml:space="preserve"> query </w:t>
+      </w:r>
+      <w:proofErr w:type="spellStart"/>
+      <w:r>
+        <w:t>của</w:t>
+      </w:r>
+      <w:proofErr w:type="spellEnd"/>
+      <w:r>
+        <w:t xml:space="preserve"> user </w:t>
+      </w:r>
+      <w:proofErr w:type="spellStart"/>
+      <w:r>
+        <w:t>tương</w:t>
+      </w:r>
+      <w:proofErr w:type="spellEnd"/>
+      <w:r>
+        <w:t xml:space="preserve"> </w:t>
+      </w:r>
+      <w:proofErr w:type="spellStart"/>
+      <w:r>
+        <w:t>ứng</w:t>
+      </w:r>
+      <w:proofErr w:type="spellEnd"/>
+      <w:r>
+        <w:t xml:space="preserve"> (1đ).</w:t>
       </w:r>
     </w:p>
     <w:p>
@@ -574,13 +2184,130 @@
         <w:jc w:val="both"/>
       </w:pPr>
       <w:r>
-        <w:t>Các nhân viên quản lý NV1, NV2, QL hoàn thành dự án, admin thu hồi quyền đã cấp. Xóa</w:t>
-      </w:r>
-      <w:r>
-        <w:t xml:space="preserve"> </w:t>
-      </w:r>
-      <w:r>
-        <w:t>role NhanVien. (1đ).</w:t>
+        <w:t xml:space="preserve">Các </w:t>
+      </w:r>
+      <w:proofErr w:type="spellStart"/>
+      <w:r>
+        <w:t>nhân</w:t>
+      </w:r>
+      <w:proofErr w:type="spellEnd"/>
+      <w:r>
+        <w:t xml:space="preserve"> </w:t>
+      </w:r>
+      <w:proofErr w:type="spellStart"/>
+      <w:r>
+        <w:t>viên</w:t>
+      </w:r>
+      <w:proofErr w:type="spellEnd"/>
+      <w:r>
+        <w:t xml:space="preserve"> </w:t>
+      </w:r>
+      <w:proofErr w:type="spellStart"/>
+      <w:r>
+        <w:t>quản</w:t>
+      </w:r>
+      <w:proofErr w:type="spellEnd"/>
+      <w:r>
+        <w:t xml:space="preserve"> </w:t>
+      </w:r>
+      <w:proofErr w:type="spellStart"/>
+      <w:r>
+        <w:t>lý</w:t>
+      </w:r>
+      <w:proofErr w:type="spellEnd"/>
+      <w:r>
+        <w:t xml:space="preserve"> NV1, NV2, QL </w:t>
+      </w:r>
+      <w:proofErr w:type="spellStart"/>
+      <w:r>
+        <w:t>hoàn</w:t>
+      </w:r>
+      <w:proofErr w:type="spellEnd"/>
+      <w:r>
+        <w:t xml:space="preserve"> </w:t>
+      </w:r>
+      <w:proofErr w:type="spellStart"/>
+      <w:r>
+        <w:t>thành</w:t>
+      </w:r>
+      <w:proofErr w:type="spellEnd"/>
+      <w:r>
+        <w:t xml:space="preserve"> </w:t>
+      </w:r>
+      <w:proofErr w:type="spellStart"/>
+      <w:r>
+        <w:t>dự</w:t>
+      </w:r>
+      <w:proofErr w:type="spellEnd"/>
+      <w:r>
+        <w:t xml:space="preserve"> </w:t>
+      </w:r>
+      <w:proofErr w:type="spellStart"/>
+      <w:r>
+        <w:t>án</w:t>
+      </w:r>
+      <w:proofErr w:type="spellEnd"/>
+      <w:r>
+        <w:t xml:space="preserve">, admin </w:t>
+      </w:r>
+      <w:proofErr w:type="spellStart"/>
+      <w:r>
+        <w:t>thu</w:t>
+      </w:r>
+      <w:proofErr w:type="spellEnd"/>
+      <w:r>
+        <w:t xml:space="preserve"> </w:t>
+      </w:r>
+      <w:proofErr w:type="spellStart"/>
+      <w:r>
+        <w:t>hồi</w:t>
+      </w:r>
+      <w:proofErr w:type="spellEnd"/>
+      <w:r>
+        <w:t xml:space="preserve"> </w:t>
+      </w:r>
+      <w:proofErr w:type="spellStart"/>
+      <w:r>
+        <w:t>quyền</w:t>
+      </w:r>
+      <w:proofErr w:type="spellEnd"/>
+      <w:r>
+        <w:t xml:space="preserve"> </w:t>
+      </w:r>
+      <w:proofErr w:type="spellStart"/>
+      <w:r>
+        <w:t>đã</w:t>
+      </w:r>
+      <w:proofErr w:type="spellEnd"/>
+      <w:r>
+        <w:t xml:space="preserve"> </w:t>
+      </w:r>
+      <w:proofErr w:type="spellStart"/>
+      <w:r>
+        <w:t>cấp</w:t>
+      </w:r>
+      <w:proofErr w:type="spellEnd"/>
+      <w:r>
+        <w:t xml:space="preserve">. </w:t>
+      </w:r>
+      <w:proofErr w:type="spellStart"/>
+      <w:r>
+        <w:t>Xóa</w:t>
+      </w:r>
+      <w:proofErr w:type="spellEnd"/>
+      <w:r>
+        <w:t xml:space="preserve"> </w:t>
+      </w:r>
+      <w:r>
+        <w:t xml:space="preserve">role </w:t>
+      </w:r>
+      <w:proofErr w:type="spellStart"/>
+      <w:r>
+        <w:t>NhanVien</w:t>
+      </w:r>
+      <w:proofErr w:type="spellEnd"/>
+      <w:r>
+        <w:t>. (1đ).</w:t>
       </w:r>
     </w:p>
     <w:p>
@@ -607,13 +2334,21 @@
           <w:bCs/>
         </w:rPr>
       </w:pPr>
+      <w:proofErr w:type="spellStart"/>
       <w:r>
         <w:rPr>
           <w:b/>
           <w:bCs/>
         </w:rPr>
-        <w:lastRenderedPageBreak/>
-        <w:t>Câu 2: (LO4) (4đ)</w:t>
+        <w:t>Câu</w:t>
+      </w:r>
+      <w:proofErr w:type="spellEnd"/>
+      <w:r>
+        <w:rPr>
+          <w:b/>
+          <w:bCs/>
+        </w:rPr>
+        <w:t xml:space="preserve"> 2: (LO4) (4đ)</w:t>
       </w:r>
     </w:p>
     <w:p>
@@ -622,8 +2357,285 @@
         <w:ind w:firstLine="720"/>
         <w:jc w:val="both"/>
       </w:pPr>
-      <w:r>
-        <w:t>Hãy lên kế hoạch phục hồi cơ sở dữ liệu cho các hoạt động sau bằng cách viết các lệnh Backup tại các vị trí [...] để thực hiện Restore cơ sở dữ liệu theo yêu cầu ở câu d.</w:t>
+      <w:proofErr w:type="spellStart"/>
+      <w:r>
+        <w:t>Hãy</w:t>
+      </w:r>
+      <w:proofErr w:type="spellEnd"/>
+      <w:r>
+        <w:t xml:space="preserve"> </w:t>
+      </w:r>
+      <w:proofErr w:type="spellStart"/>
+      <w:r>
+        <w:t>lên</w:t>
+      </w:r>
+      <w:proofErr w:type="spellEnd"/>
+      <w:r>
+        <w:t xml:space="preserve"> </w:t>
+      </w:r>
+      <w:proofErr w:type="spellStart"/>
+      <w:r>
+        <w:t>kế</w:t>
+      </w:r>
+      <w:proofErr w:type="spellEnd"/>
+      <w:r>
+        <w:t xml:space="preserve"> </w:t>
+      </w:r>
+      <w:proofErr w:type="spellStart"/>
+      <w:r>
+        <w:t>hoạch</w:t>
+      </w:r>
+      <w:proofErr w:type="spellEnd"/>
+      <w:r>
+        <w:t xml:space="preserve"> </w:t>
+      </w:r>
+      <w:proofErr w:type="spellStart"/>
+      <w:r>
+        <w:t>phục</w:t>
+      </w:r>
+      <w:proofErr w:type="spellEnd"/>
+      <w:r>
+        <w:t xml:space="preserve"> </w:t>
+      </w:r>
+      <w:proofErr w:type="spellStart"/>
+      <w:r>
+        <w:t>hồi</w:t>
+      </w:r>
+      <w:proofErr w:type="spellEnd"/>
+      <w:r>
+        <w:t xml:space="preserve"> </w:t>
+      </w:r>
+      <w:proofErr w:type="spellStart"/>
+      <w:r>
+        <w:t>cơ</w:t>
+      </w:r>
+      <w:proofErr w:type="spellEnd"/>
+      <w:r>
+        <w:t xml:space="preserve"> </w:t>
+      </w:r>
+      <w:proofErr w:type="spellStart"/>
+      <w:r>
+        <w:t>sở</w:t>
+      </w:r>
+      <w:proofErr w:type="spellEnd"/>
+      <w:r>
+        <w:t xml:space="preserve"> </w:t>
+      </w:r>
+      <w:proofErr w:type="spellStart"/>
+      <w:r>
+        <w:t>dữ</w:t>
+      </w:r>
+      <w:proofErr w:type="spellEnd"/>
+      <w:r>
+        <w:t xml:space="preserve"> </w:t>
+      </w:r>
+      <w:proofErr w:type="spellStart"/>
+      <w:r>
+        <w:t>liệu</w:t>
+      </w:r>
+      <w:proofErr w:type="spellEnd"/>
+      <w:r>
+        <w:t xml:space="preserve"> </w:t>
+      </w:r>
+      <w:proofErr w:type="spellStart"/>
+      <w:r>
+        <w:t>cho</w:t>
+      </w:r>
+      <w:proofErr w:type="spellEnd"/>
+      <w:r>
+        <w:t xml:space="preserve"> </w:t>
+      </w:r>
+      <w:proofErr w:type="spellStart"/>
+      <w:r>
+        <w:t>các</w:t>
+      </w:r>
+      <w:proofErr w:type="spellEnd"/>
+      <w:r>
+        <w:t xml:space="preserve"> </w:t>
+      </w:r>
+      <w:proofErr w:type="spellStart"/>
+      <w:r>
+        <w:t>hoạt</w:t>
+      </w:r>
+      <w:proofErr w:type="spellEnd"/>
+      <w:r>
+        <w:t xml:space="preserve"> </w:t>
+      </w:r>
+      <w:proofErr w:type="spellStart"/>
+      <w:r>
+        <w:t>động</w:t>
+      </w:r>
+      <w:proofErr w:type="spellEnd"/>
+      <w:r>
+        <w:t xml:space="preserve"> </w:t>
+      </w:r>
+      <w:proofErr w:type="spellStart"/>
+      <w:r>
+        <w:t>sau</w:t>
+      </w:r>
+      <w:proofErr w:type="spellEnd"/>
+      <w:r>
+        <w:t xml:space="preserve"> </w:t>
+      </w:r>
+      <w:proofErr w:type="spellStart"/>
+      <w:r>
+        <w:t>bằng</w:t>
+      </w:r>
+      <w:proofErr w:type="spellEnd"/>
+      <w:r>
+        <w:t xml:space="preserve"> </w:t>
+      </w:r>
+      <w:proofErr w:type="spellStart"/>
+      <w:r>
+        <w:t>cách</w:t>
+      </w:r>
+      <w:proofErr w:type="spellEnd"/>
+      <w:r>
+        <w:t xml:space="preserve"> </w:t>
+      </w:r>
+      <w:proofErr w:type="spellStart"/>
+      <w:r>
+        <w:t>viết</w:t>
+      </w:r>
+      <w:proofErr w:type="spellEnd"/>
+      <w:r>
+        <w:t xml:space="preserve"> </w:t>
+      </w:r>
+      <w:proofErr w:type="spellStart"/>
+      <w:r>
+        <w:t>các</w:t>
+      </w:r>
+      <w:proofErr w:type="spellEnd"/>
+      <w:r>
+        <w:t xml:space="preserve"> </w:t>
+      </w:r>
+      <w:proofErr w:type="spellStart"/>
+      <w:r>
+        <w:t>lệnh</w:t>
+      </w:r>
+      <w:proofErr w:type="spellEnd"/>
+      <w:r>
+        <w:t xml:space="preserve"> Backup </w:t>
+      </w:r>
+      <w:proofErr w:type="spellStart"/>
+      <w:r>
+        <w:t>tại</w:t>
+      </w:r>
+      <w:proofErr w:type="spellEnd"/>
+      <w:r>
+        <w:t xml:space="preserve"> </w:t>
+      </w:r>
+      <w:proofErr w:type="spellStart"/>
+      <w:r>
+        <w:t>các</w:t>
+      </w:r>
+      <w:proofErr w:type="spellEnd"/>
+      <w:r>
+        <w:t xml:space="preserve"> </w:t>
+      </w:r>
+      <w:proofErr w:type="spellStart"/>
+      <w:r>
+        <w:t>vị</w:t>
+      </w:r>
+      <w:proofErr w:type="spellEnd"/>
+      <w:r>
+        <w:t xml:space="preserve"> </w:t>
+      </w:r>
+      <w:proofErr w:type="spellStart"/>
+      <w:r>
+        <w:t>trí</w:t>
+      </w:r>
+      <w:proofErr w:type="spellEnd"/>
+      <w:r>
+        <w:t xml:space="preserve"> [...] </w:t>
+      </w:r>
+      <w:proofErr w:type="spellStart"/>
+      <w:r>
+        <w:t>để</w:t>
+      </w:r>
+      <w:proofErr w:type="spellEnd"/>
+      <w:r>
+        <w:t xml:space="preserve"> </w:t>
+      </w:r>
+      <w:proofErr w:type="spellStart"/>
+      <w:r>
+        <w:t>thực</w:t>
+      </w:r>
+      <w:proofErr w:type="spellEnd"/>
+      <w:r>
+        <w:t xml:space="preserve"> </w:t>
+      </w:r>
+      <w:proofErr w:type="spellStart"/>
+      <w:r>
+        <w:t>hiện</w:t>
+      </w:r>
+      <w:proofErr w:type="spellEnd"/>
+      <w:r>
+        <w:t xml:space="preserve"> Restore </w:t>
+      </w:r>
+      <w:proofErr w:type="spellStart"/>
+      <w:r>
+        <w:t>cơ</w:t>
+      </w:r>
+      <w:proofErr w:type="spellEnd"/>
+      <w:r>
+        <w:t xml:space="preserve"> </w:t>
+      </w:r>
+      <w:proofErr w:type="spellStart"/>
+      <w:r>
+        <w:t>sở</w:t>
+      </w:r>
+      <w:proofErr w:type="spellEnd"/>
+      <w:r>
+        <w:t xml:space="preserve"> </w:t>
+      </w:r>
+      <w:proofErr w:type="spellStart"/>
+      <w:r>
+        <w:t>dữ</w:t>
+      </w:r>
+      <w:proofErr w:type="spellEnd"/>
+      <w:r>
+        <w:t xml:space="preserve"> </w:t>
+      </w:r>
+      <w:proofErr w:type="spellStart"/>
+      <w:r>
+        <w:t>liệu</w:t>
+      </w:r>
+      <w:proofErr w:type="spellEnd"/>
+      <w:r>
+        <w:t xml:space="preserve"> </w:t>
+      </w:r>
+      <w:proofErr w:type="spellStart"/>
+      <w:r>
+        <w:t>theo</w:t>
+      </w:r>
+      <w:proofErr w:type="spellEnd"/>
+      <w:r>
+        <w:t xml:space="preserve"> </w:t>
+      </w:r>
+      <w:proofErr w:type="spellStart"/>
+      <w:r>
+        <w:t>yêu</w:t>
+      </w:r>
+      <w:proofErr w:type="spellEnd"/>
+      <w:r>
+        <w:t xml:space="preserve"> </w:t>
+      </w:r>
+      <w:proofErr w:type="spellStart"/>
+      <w:r>
+        <w:t>cầu</w:t>
+      </w:r>
+      <w:proofErr w:type="spellEnd"/>
+      <w:r>
+        <w:t xml:space="preserve"> ở </w:t>
+      </w:r>
+      <w:proofErr w:type="spellStart"/>
+      <w:r>
+        <w:t>câu</w:t>
+      </w:r>
+      <w:proofErr w:type="spellEnd"/>
+      <w:r>
+        <w:t xml:space="preserve"> d.</w:t>
       </w:r>
     </w:p>
     <w:p>
@@ -636,20 +2648,259 @@
         <w:spacing w:after="0" w:line="360" w:lineRule="auto"/>
         <w:jc w:val="both"/>
       </w:pPr>
-      <w:r>
-        <w:t>Tạo một transaction tăng lương (Rate) thêm 10% cho các nhân viên làm việc ca</w:t>
-      </w:r>
-      <w:r>
-        <w:t xml:space="preserve"> </w:t>
-      </w:r>
-      <w:r>
-        <w:t>(Shift.Name) chiều và tăng 20% lương cho các nhân viên làm việc ca đêm. [Ghi nhận dữ</w:t>
-      </w:r>
-      <w:r>
-        <w:t xml:space="preserve"> </w:t>
-      </w:r>
-      <w:r>
-        <w:t>liệu đang có và Viết lệnh Full Backup]. (1đ)</w:t>
+      <w:proofErr w:type="spellStart"/>
+      <w:r>
+        <w:t>Tạo</w:t>
+      </w:r>
+      <w:proofErr w:type="spellEnd"/>
+      <w:r>
+        <w:t xml:space="preserve"> </w:t>
+      </w:r>
+      <w:proofErr w:type="spellStart"/>
+      <w:r>
+        <w:t>một</w:t>
+      </w:r>
+      <w:proofErr w:type="spellEnd"/>
+      <w:r>
+        <w:t xml:space="preserve"> transaction </w:t>
+      </w:r>
+      <w:proofErr w:type="spellStart"/>
+      <w:r>
+        <w:t>tăng</w:t>
+      </w:r>
+      <w:proofErr w:type="spellEnd"/>
+      <w:r>
+        <w:t xml:space="preserve"> </w:t>
+      </w:r>
+      <w:proofErr w:type="spellStart"/>
+      <w:r>
+        <w:t>lương</w:t>
+      </w:r>
+      <w:proofErr w:type="spellEnd"/>
+      <w:r>
+        <w:t xml:space="preserve"> (Rate) </w:t>
+      </w:r>
+      <w:proofErr w:type="spellStart"/>
+      <w:r>
+        <w:t>thêm</w:t>
+      </w:r>
+      <w:proofErr w:type="spellEnd"/>
+      <w:r>
+        <w:t xml:space="preserve"> 10% </w:t>
+      </w:r>
+      <w:proofErr w:type="spellStart"/>
+      <w:r>
+        <w:t>cho</w:t>
+      </w:r>
+      <w:proofErr w:type="spellEnd"/>
+      <w:r>
+        <w:t xml:space="preserve"> </w:t>
+      </w:r>
+      <w:proofErr w:type="spellStart"/>
+      <w:r>
+        <w:t>các</w:t>
+      </w:r>
+      <w:proofErr w:type="spellEnd"/>
+      <w:r>
+        <w:t xml:space="preserve"> </w:t>
+      </w:r>
+      <w:proofErr w:type="spellStart"/>
+      <w:r>
+        <w:t>nhân</w:t>
+      </w:r>
+      <w:proofErr w:type="spellEnd"/>
+      <w:r>
+        <w:t xml:space="preserve"> </w:t>
+      </w:r>
+      <w:proofErr w:type="spellStart"/>
+      <w:r>
+        <w:t>viên</w:t>
+      </w:r>
+      <w:proofErr w:type="spellEnd"/>
+      <w:r>
+        <w:t xml:space="preserve"> </w:t>
+      </w:r>
+      <w:proofErr w:type="spellStart"/>
+      <w:r>
+        <w:t>làm</w:t>
+      </w:r>
+      <w:proofErr w:type="spellEnd"/>
+      <w:r>
+        <w:t xml:space="preserve"> </w:t>
+      </w:r>
+      <w:proofErr w:type="spellStart"/>
+      <w:r>
+        <w:t>việc</w:t>
+      </w:r>
+      <w:proofErr w:type="spellEnd"/>
+      <w:r>
+        <w:t xml:space="preserve"> ca</w:t>
+      </w:r>
+      <w:r>
+        <w:t xml:space="preserve"> </w:t>
+      </w:r>
+      <w:r>
+        <w:t>(</w:t>
+      </w:r>
+      <w:proofErr w:type="spellStart"/>
+      <w:r>
+        <w:t>Shift.Name</w:t>
+      </w:r>
+      <w:proofErr w:type="spellEnd"/>
+      <w:r>
+        <w:t xml:space="preserve">) </w:t>
+      </w:r>
+      <w:proofErr w:type="spellStart"/>
+      <w:r>
+        <w:t>chiều</w:t>
+      </w:r>
+      <w:proofErr w:type="spellEnd"/>
+      <w:r>
+        <w:t xml:space="preserve"> </w:t>
+      </w:r>
+      <w:proofErr w:type="spellStart"/>
+      <w:r>
+        <w:t>và</w:t>
+      </w:r>
+      <w:proofErr w:type="spellEnd"/>
+      <w:r>
+        <w:t xml:space="preserve"> </w:t>
+      </w:r>
+      <w:proofErr w:type="spellStart"/>
+      <w:r>
+        <w:t>tăng</w:t>
+      </w:r>
+      <w:proofErr w:type="spellEnd"/>
+      <w:r>
+        <w:t xml:space="preserve"> 20% </w:t>
+      </w:r>
+      <w:proofErr w:type="spellStart"/>
+      <w:r>
+        <w:t>lương</w:t>
+      </w:r>
+      <w:proofErr w:type="spellEnd"/>
+      <w:r>
+        <w:t xml:space="preserve"> </w:t>
+      </w:r>
+      <w:proofErr w:type="spellStart"/>
+      <w:r>
+        <w:t>cho</w:t>
+      </w:r>
+      <w:proofErr w:type="spellEnd"/>
+      <w:r>
+        <w:t xml:space="preserve"> </w:t>
+      </w:r>
+      <w:proofErr w:type="spellStart"/>
+      <w:r>
+        <w:t>các</w:t>
+      </w:r>
+      <w:proofErr w:type="spellEnd"/>
+      <w:r>
+        <w:t xml:space="preserve"> </w:t>
+      </w:r>
+      <w:proofErr w:type="spellStart"/>
+      <w:r>
+        <w:t>nhân</w:t>
+      </w:r>
+      <w:proofErr w:type="spellEnd"/>
+      <w:r>
+        <w:t xml:space="preserve"> </w:t>
+      </w:r>
+      <w:proofErr w:type="spellStart"/>
+      <w:r>
+        <w:t>viên</w:t>
+      </w:r>
+      <w:proofErr w:type="spellEnd"/>
+      <w:r>
+        <w:t xml:space="preserve"> </w:t>
+      </w:r>
+      <w:proofErr w:type="spellStart"/>
+      <w:r>
+        <w:t>làm</w:t>
+      </w:r>
+      <w:proofErr w:type="spellEnd"/>
+      <w:r>
+        <w:t xml:space="preserve"> </w:t>
+      </w:r>
+      <w:proofErr w:type="spellStart"/>
+      <w:r>
+        <w:t>việc</w:t>
+      </w:r>
+      <w:proofErr w:type="spellEnd"/>
+      <w:r>
+        <w:t xml:space="preserve"> ca </w:t>
+      </w:r>
+      <w:proofErr w:type="spellStart"/>
+      <w:r>
+        <w:t>đêm</w:t>
+      </w:r>
+      <w:proofErr w:type="spellEnd"/>
+      <w:r>
+        <w:t>. [</w:t>
+      </w:r>
+      <w:proofErr w:type="spellStart"/>
+      <w:r>
+        <w:t>Ghi</w:t>
+      </w:r>
+      <w:proofErr w:type="spellEnd"/>
+      <w:r>
+        <w:t xml:space="preserve"> </w:t>
+      </w:r>
+      <w:proofErr w:type="spellStart"/>
+      <w:r>
+        <w:t>nhận</w:t>
+      </w:r>
+      <w:proofErr w:type="spellEnd"/>
+      <w:r>
+        <w:t xml:space="preserve"> </w:t>
+      </w:r>
+      <w:proofErr w:type="spellStart"/>
+      <w:r>
+        <w:t>dữ</w:t>
+      </w:r>
+      <w:proofErr w:type="spellEnd"/>
+      <w:r>
+        <w:t xml:space="preserve"> </w:t>
+      </w:r>
+      <w:proofErr w:type="spellStart"/>
+      <w:r>
+        <w:t>liệu</w:t>
+      </w:r>
+      <w:proofErr w:type="spellEnd"/>
+      <w:r>
+        <w:t xml:space="preserve"> </w:t>
+      </w:r>
+      <w:proofErr w:type="spellStart"/>
+      <w:r>
+        <w:t>đang</w:t>
+      </w:r>
+      <w:proofErr w:type="spellEnd"/>
+      <w:r>
+        <w:t xml:space="preserve"> </w:t>
+      </w:r>
+      <w:proofErr w:type="spellStart"/>
+      <w:r>
+        <w:t>có</w:t>
+      </w:r>
+      <w:proofErr w:type="spellEnd"/>
+      <w:r>
+        <w:t xml:space="preserve"> </w:t>
+      </w:r>
+      <w:proofErr w:type="spellStart"/>
+      <w:r>
+        <w:t>và</w:t>
+      </w:r>
+      <w:proofErr w:type="spellEnd"/>
+      <w:r>
+        <w:t xml:space="preserve"> Viết </w:t>
+      </w:r>
+      <w:proofErr w:type="spellStart"/>
+      <w:r>
+        <w:t>lệnh</w:t>
+      </w:r>
+      <w:proofErr w:type="spellEnd"/>
+      <w:r>
+        <w:t xml:space="preserve"> Full Backup]. (1đ)</w:t>
       </w:r>
     </w:p>
     <w:p>
@@ -662,8 +2913,77 @@
         <w:spacing w:after="0" w:line="360" w:lineRule="auto"/>
         <w:jc w:val="both"/>
       </w:pPr>
-      <w:r>
-        <w:t>Xóa mọi bản ghi trong bảng ProductCostHistory. [Viết lệnh Differential Backup] (1đ).</w:t>
+      <w:proofErr w:type="spellStart"/>
+      <w:r>
+        <w:t>Xóa</w:t>
+      </w:r>
+      <w:proofErr w:type="spellEnd"/>
+      <w:r>
+        <w:t xml:space="preserve"> </w:t>
+      </w:r>
+      <w:proofErr w:type="spellStart"/>
+      <w:r>
+        <w:t>mọi</w:t>
+      </w:r>
+      <w:proofErr w:type="spellEnd"/>
+      <w:r>
+        <w:t xml:space="preserve"> </w:t>
+      </w:r>
+      <w:proofErr w:type="spellStart"/>
+      <w:r>
+        <w:t>bản</w:t>
+      </w:r>
+      <w:proofErr w:type="spellEnd"/>
+      <w:r>
+        <w:t xml:space="preserve"> </w:t>
+      </w:r>
+      <w:proofErr w:type="spellStart"/>
+      <w:r>
+        <w:t>ghi</w:t>
+      </w:r>
+      <w:proofErr w:type="spellEnd"/>
+      <w:r>
+        <w:t xml:space="preserve"> </w:t>
+      </w:r>
+      <w:proofErr w:type="spellStart"/>
+      <w:r>
+        <w:t>trong</w:t>
+      </w:r>
+      <w:proofErr w:type="spellEnd"/>
+      <w:r>
+        <w:t xml:space="preserve"> </w:t>
+      </w:r>
+      <w:proofErr w:type="spellStart"/>
+      <w:r>
+        <w:t>bảng</w:t>
+      </w:r>
+      <w:proofErr w:type="spellEnd"/>
+      <w:r>
+        <w:t xml:space="preserve"> </w:t>
+      </w:r>
+      <w:proofErr w:type="spellStart"/>
+      <w:r>
+        <w:t>ProductCostHistory</w:t>
+      </w:r>
+      <w:proofErr w:type="spellEnd"/>
+      <w:r>
+        <w:t>. [</w:t>
+      </w:r>
+      <w:proofErr w:type="spellStart"/>
+      <w:r>
+        <w:t>Viết</w:t>
+      </w:r>
+      <w:proofErr w:type="spellEnd"/>
+      <w:r>
+        <w:t xml:space="preserve"> </w:t>
+      </w:r>
+      <w:proofErr w:type="spellStart"/>
+      <w:r>
+        <w:t>lệnh</w:t>
+      </w:r>
+      <w:proofErr w:type="spellEnd"/>
+      <w:r>
+        <w:t xml:space="preserve"> Differential Backup] (1đ).</w:t>
       </w:r>
     </w:p>
     <w:p>
@@ -676,20 +2996,293 @@
         <w:spacing w:after="0" w:line="360" w:lineRule="auto"/>
         <w:jc w:val="both"/>
       </w:pPr>
-      <w:r>
-        <w:t>Bổ sung thêm 1 số phone mới (Person.PersonPhone) tùy ý cho nhân viên có mã số nhân</w:t>
-      </w:r>
-      <w:r>
-        <w:t xml:space="preserve"> </w:t>
-      </w:r>
-      <w:r>
-        <w:t>viên (BusinessEntityID) là 4 ký tự cuối của Mã SV của chính SV dự thi,</w:t>
-      </w:r>
-      <w:r>
-        <w:t xml:space="preserve"> </w:t>
-      </w:r>
-      <w:r>
-        <w:t>ModifiedDate=getdate() . [Ghi nhận dữ liệu đang có và Viết lệnh Log Backup] (1đ).</w:t>
+      <w:proofErr w:type="spellStart"/>
+      <w:r>
+        <w:t>Bổ</w:t>
+      </w:r>
+      <w:proofErr w:type="spellEnd"/>
+      <w:r>
+        <w:t xml:space="preserve"> sung </w:t>
+      </w:r>
+      <w:proofErr w:type="spellStart"/>
+      <w:r>
+        <w:t>thêm</w:t>
+      </w:r>
+      <w:proofErr w:type="spellEnd"/>
+      <w:r>
+        <w:t xml:space="preserve"> 1 </w:t>
+      </w:r>
+      <w:proofErr w:type="spellStart"/>
+      <w:r>
+        <w:t>số</w:t>
+      </w:r>
+      <w:proofErr w:type="spellEnd"/>
+      <w:r>
+        <w:t xml:space="preserve"> phone </w:t>
+      </w:r>
+      <w:proofErr w:type="spellStart"/>
+      <w:r>
+        <w:t>mới</w:t>
+      </w:r>
+      <w:proofErr w:type="spellEnd"/>
+      <w:r>
+        <w:t xml:space="preserve"> (</w:t>
+      </w:r>
+      <w:proofErr w:type="spellStart"/>
+      <w:r>
+        <w:t>Person.PersonPhone</w:t>
+      </w:r>
+      <w:proofErr w:type="spellEnd"/>
+      <w:r>
+        <w:t xml:space="preserve">) </w:t>
+      </w:r>
+      <w:proofErr w:type="spellStart"/>
+      <w:r>
+        <w:t>tùy</w:t>
+      </w:r>
+      <w:proofErr w:type="spellEnd"/>
+      <w:r>
+        <w:t xml:space="preserve"> ý </w:t>
+      </w:r>
+      <w:proofErr w:type="spellStart"/>
+      <w:r>
+        <w:t>cho</w:t>
+      </w:r>
+      <w:proofErr w:type="spellEnd"/>
+      <w:r>
+        <w:t xml:space="preserve"> </w:t>
+      </w:r>
+      <w:proofErr w:type="spellStart"/>
+      <w:r>
+        <w:t>nhân</w:t>
+      </w:r>
+      <w:proofErr w:type="spellEnd"/>
+      <w:r>
+        <w:t xml:space="preserve"> </w:t>
+      </w:r>
+      <w:proofErr w:type="spellStart"/>
+      <w:r>
+        <w:t>viên</w:t>
+      </w:r>
+      <w:proofErr w:type="spellEnd"/>
+      <w:r>
+        <w:t xml:space="preserve"> </w:t>
+      </w:r>
+      <w:proofErr w:type="spellStart"/>
+      <w:r>
+        <w:t>có</w:t>
+      </w:r>
+      <w:proofErr w:type="spellEnd"/>
+      <w:r>
+        <w:t xml:space="preserve"> </w:t>
+      </w:r>
+      <w:proofErr w:type="spellStart"/>
+      <w:r>
+        <w:t>mã</w:t>
+      </w:r>
+      <w:proofErr w:type="spellEnd"/>
+      <w:r>
+        <w:t xml:space="preserve"> </w:t>
+      </w:r>
+      <w:proofErr w:type="spellStart"/>
+      <w:r>
+        <w:t>số</w:t>
+      </w:r>
+      <w:proofErr w:type="spellEnd"/>
+      <w:r>
+        <w:t xml:space="preserve"> </w:t>
+      </w:r>
+      <w:proofErr w:type="spellStart"/>
+      <w:r>
+        <w:t>nhân</w:t>
+      </w:r>
+      <w:proofErr w:type="spellEnd"/>
+      <w:r>
+        <w:t xml:space="preserve"> </w:t>
+      </w:r>
+      <w:proofErr w:type="spellStart"/>
+      <w:r>
+        <w:t>viên</w:t>
+      </w:r>
+      <w:proofErr w:type="spellEnd"/>
+      <w:r>
+        <w:t xml:space="preserve"> (</w:t>
+      </w:r>
+      <w:proofErr w:type="spellStart"/>
+      <w:r>
+        <w:t>BusinessEntityID</w:t>
+      </w:r>
+      <w:proofErr w:type="spellEnd"/>
+      <w:r>
+        <w:t xml:space="preserve">) </w:t>
+      </w:r>
+      <w:proofErr w:type="spellStart"/>
+      <w:r>
+        <w:t>là</w:t>
+      </w:r>
+      <w:proofErr w:type="spellEnd"/>
+      <w:r>
+        <w:t xml:space="preserve"> 4 </w:t>
+      </w:r>
+      <w:proofErr w:type="spellStart"/>
+      <w:r>
+        <w:t>ký</w:t>
+      </w:r>
+      <w:proofErr w:type="spellEnd"/>
+      <w:r>
+        <w:t xml:space="preserve"> </w:t>
+      </w:r>
+      <w:proofErr w:type="spellStart"/>
+      <w:r>
+        <w:t>tự</w:t>
+      </w:r>
+      <w:proofErr w:type="spellEnd"/>
+      <w:r>
+        <w:t xml:space="preserve"> </w:t>
+      </w:r>
+      <w:proofErr w:type="spellStart"/>
+      <w:r>
+        <w:t>cuối</w:t>
+      </w:r>
+      <w:proofErr w:type="spellEnd"/>
+      <w:r>
+        <w:t xml:space="preserve"> </w:t>
+      </w:r>
+      <w:proofErr w:type="spellStart"/>
+      <w:r>
+        <w:t>của</w:t>
+      </w:r>
+      <w:proofErr w:type="spellEnd"/>
+      <w:r>
+        <w:t xml:space="preserve"> </w:t>
+      </w:r>
+      <w:proofErr w:type="spellStart"/>
+      <w:r>
+        <w:t>Mã</w:t>
+      </w:r>
+      <w:proofErr w:type="spellEnd"/>
+      <w:r>
+        <w:t xml:space="preserve"> SV </w:t>
+      </w:r>
+      <w:proofErr w:type="spellStart"/>
+      <w:r>
+        <w:t>của</w:t>
+      </w:r>
+      <w:proofErr w:type="spellEnd"/>
+      <w:r>
+        <w:t xml:space="preserve"> </w:t>
+      </w:r>
+      <w:proofErr w:type="spellStart"/>
+      <w:r>
+        <w:t>chính</w:t>
+      </w:r>
+      <w:proofErr w:type="spellEnd"/>
+      <w:r>
+        <w:t xml:space="preserve"> SV </w:t>
+      </w:r>
+      <w:proofErr w:type="spellStart"/>
+      <w:r>
+        <w:t>dự</w:t>
+      </w:r>
+      <w:proofErr w:type="spellEnd"/>
+      <w:r>
+        <w:t xml:space="preserve"> </w:t>
+      </w:r>
+      <w:proofErr w:type="spellStart"/>
+      <w:r>
+        <w:t>thi</w:t>
+      </w:r>
+      <w:proofErr w:type="spellEnd"/>
+      <w:r>
+        <w:t>,</w:t>
+      </w:r>
+      <w:r>
+        <w:t xml:space="preserve"> </w:t>
+      </w:r>
+      <w:proofErr w:type="spellStart"/>
+      <w:r>
+        <w:t>ModifiedDate</w:t>
+      </w:r>
+      <w:proofErr w:type="spellEnd"/>
+      <w:r>
+        <w:t>=</w:t>
+      </w:r>
+      <w:proofErr w:type="spellStart"/>
+      <w:proofErr w:type="gramStart"/>
+      <w:r>
+        <w:t>getdate</w:t>
+      </w:r>
+      <w:proofErr w:type="spellEnd"/>
+      <w:r>
+        <w:t>() .</w:t>
+      </w:r>
+      <w:proofErr w:type="gramEnd"/>
+      <w:r>
+        <w:t xml:space="preserve"> [</w:t>
+      </w:r>
+      <w:proofErr w:type="spellStart"/>
+      <w:r>
+        <w:t>Ghi</w:t>
+      </w:r>
+      <w:proofErr w:type="spellEnd"/>
+      <w:r>
+        <w:t xml:space="preserve"> </w:t>
+      </w:r>
+      <w:proofErr w:type="spellStart"/>
+      <w:r>
+        <w:t>nhận</w:t>
+      </w:r>
+      <w:proofErr w:type="spellEnd"/>
+      <w:r>
+        <w:t xml:space="preserve"> </w:t>
+      </w:r>
+      <w:proofErr w:type="spellStart"/>
+      <w:r>
+        <w:t>dữ</w:t>
+      </w:r>
+      <w:proofErr w:type="spellEnd"/>
+      <w:r>
+        <w:t xml:space="preserve"> </w:t>
+      </w:r>
+      <w:proofErr w:type="spellStart"/>
+      <w:r>
+        <w:t>liệu</w:t>
+      </w:r>
+      <w:proofErr w:type="spellEnd"/>
+      <w:r>
+        <w:t xml:space="preserve"> </w:t>
+      </w:r>
+      <w:proofErr w:type="spellStart"/>
+      <w:r>
+        <w:t>đang</w:t>
+      </w:r>
+      <w:proofErr w:type="spellEnd"/>
+      <w:r>
+        <w:t xml:space="preserve"> </w:t>
+      </w:r>
+      <w:proofErr w:type="spellStart"/>
+      <w:r>
+        <w:t>có</w:t>
+      </w:r>
+      <w:proofErr w:type="spellEnd"/>
+      <w:r>
+        <w:t xml:space="preserve"> </w:t>
+      </w:r>
+      <w:proofErr w:type="spellStart"/>
+      <w:r>
+        <w:t>và</w:t>
+      </w:r>
+      <w:proofErr w:type="spellEnd"/>
+      <w:r>
+        <w:t xml:space="preserve"> Viết </w:t>
+      </w:r>
+      <w:proofErr w:type="spellStart"/>
+      <w:r>
+        <w:t>lệnh</w:t>
+      </w:r>
+      <w:proofErr w:type="spellEnd"/>
+      <w:r>
+        <w:t xml:space="preserve"> Log Backup] (1đ).</w:t>
       </w:r>
     </w:p>
     <w:p>
@@ -702,20 +3295,285 @@
         <w:spacing w:after="0" w:line="360" w:lineRule="auto"/>
         <w:jc w:val="both"/>
       </w:pPr>
-      <w:r>
-        <w:t>Xóa CSDL AdventureWorks2008R2. Phục hồi CSDL về trạng thái sau khi thực hiện bước</w:t>
-      </w:r>
-      <w:r>
-        <w:t xml:space="preserve"> </w:t>
-      </w:r>
-      <w:r>
-        <w:t>Kiểm tra xem dữ liệu phục hồi có đạt yêu cầu không (lương có tăng, các bản ghi có bị</w:t>
-      </w:r>
-      <w:r>
-        <w:t xml:space="preserve"> </w:t>
-      </w:r>
-      <w:r>
-        <w:t>xóa, có thêm số phone mới)? (1đ)</w:t>
+      <w:proofErr w:type="spellStart"/>
+      <w:r>
+        <w:t>Xóa</w:t>
+      </w:r>
+      <w:proofErr w:type="spellEnd"/>
+      <w:r>
+        <w:t xml:space="preserve"> CSDL AdventureWorks2008R2. Phục </w:t>
+      </w:r>
+      <w:proofErr w:type="spellStart"/>
+      <w:r>
+        <w:t>hồi</w:t>
+      </w:r>
+      <w:proofErr w:type="spellEnd"/>
+      <w:r>
+        <w:t xml:space="preserve"> CSDL </w:t>
+      </w:r>
+      <w:proofErr w:type="spellStart"/>
+      <w:r>
+        <w:t>về</w:t>
+      </w:r>
+      <w:proofErr w:type="spellEnd"/>
+      <w:r>
+        <w:t xml:space="preserve"> </w:t>
+      </w:r>
+      <w:proofErr w:type="spellStart"/>
+      <w:r>
+        <w:t>trạng</w:t>
+      </w:r>
+      <w:proofErr w:type="spellEnd"/>
+      <w:r>
+        <w:t xml:space="preserve"> </w:t>
+      </w:r>
+      <w:proofErr w:type="spellStart"/>
+      <w:r>
+        <w:t>thái</w:t>
+      </w:r>
+      <w:proofErr w:type="spellEnd"/>
+      <w:r>
+        <w:t xml:space="preserve"> </w:t>
+      </w:r>
+      <w:proofErr w:type="spellStart"/>
+      <w:r>
+        <w:t>sau</w:t>
+      </w:r>
+      <w:proofErr w:type="spellEnd"/>
+      <w:r>
+        <w:t xml:space="preserve"> </w:t>
+      </w:r>
+      <w:proofErr w:type="spellStart"/>
+      <w:r>
+        <w:t>khi</w:t>
+      </w:r>
+      <w:proofErr w:type="spellEnd"/>
+      <w:r>
+        <w:t xml:space="preserve"> </w:t>
+      </w:r>
+      <w:proofErr w:type="spellStart"/>
+      <w:r>
+        <w:t>thực</w:t>
+      </w:r>
+      <w:proofErr w:type="spellEnd"/>
+      <w:r>
+        <w:t xml:space="preserve"> </w:t>
+      </w:r>
+      <w:proofErr w:type="spellStart"/>
+      <w:r>
+        <w:t>hiện</w:t>
+      </w:r>
+      <w:proofErr w:type="spellEnd"/>
+      <w:r>
+        <w:t xml:space="preserve"> </w:t>
+      </w:r>
+      <w:proofErr w:type="spellStart"/>
+      <w:r>
+        <w:t>bước</w:t>
+      </w:r>
+      <w:proofErr w:type="spellEnd"/>
+      <w:r>
+        <w:t xml:space="preserve"> </w:t>
+      </w:r>
+      <w:proofErr w:type="spellStart"/>
+      <w:r>
+        <w:t>Kiểm</w:t>
+      </w:r>
+      <w:proofErr w:type="spellEnd"/>
+      <w:r>
+        <w:t xml:space="preserve"> </w:t>
+      </w:r>
+      <w:proofErr w:type="spellStart"/>
+      <w:r>
+        <w:t>tra</w:t>
+      </w:r>
+      <w:proofErr w:type="spellEnd"/>
+      <w:r>
+        <w:t xml:space="preserve"> </w:t>
+      </w:r>
+      <w:proofErr w:type="spellStart"/>
+      <w:r>
+        <w:t>xem</w:t>
+      </w:r>
+      <w:proofErr w:type="spellEnd"/>
+      <w:r>
+        <w:t xml:space="preserve"> </w:t>
+      </w:r>
+      <w:proofErr w:type="spellStart"/>
+      <w:r>
+        <w:t>dữ</w:t>
+      </w:r>
+      <w:proofErr w:type="spellEnd"/>
+      <w:r>
+        <w:t xml:space="preserve"> </w:t>
+      </w:r>
+      <w:proofErr w:type="spellStart"/>
+      <w:r>
+        <w:t>liệu</w:t>
+      </w:r>
+      <w:proofErr w:type="spellEnd"/>
+      <w:r>
+        <w:t xml:space="preserve"> </w:t>
+      </w:r>
+      <w:proofErr w:type="spellStart"/>
+      <w:r>
+        <w:t>phục</w:t>
+      </w:r>
+      <w:proofErr w:type="spellEnd"/>
+      <w:r>
+        <w:t xml:space="preserve"> </w:t>
+      </w:r>
+      <w:proofErr w:type="spellStart"/>
+      <w:r>
+        <w:t>hồi</w:t>
+      </w:r>
+      <w:proofErr w:type="spellEnd"/>
+      <w:r>
+        <w:t xml:space="preserve"> </w:t>
+      </w:r>
+      <w:proofErr w:type="spellStart"/>
+      <w:r>
+        <w:t>có</w:t>
+      </w:r>
+      <w:proofErr w:type="spellEnd"/>
+      <w:r>
+        <w:t xml:space="preserve"> </w:t>
+      </w:r>
+      <w:proofErr w:type="spellStart"/>
+      <w:r>
+        <w:t>đạt</w:t>
+      </w:r>
+      <w:proofErr w:type="spellEnd"/>
+      <w:r>
+        <w:t xml:space="preserve"> </w:t>
+      </w:r>
+      <w:proofErr w:type="spellStart"/>
+      <w:r>
+        <w:t>yêu</w:t>
+      </w:r>
+      <w:proofErr w:type="spellEnd"/>
+      <w:r>
+        <w:t xml:space="preserve"> </w:t>
+      </w:r>
+      <w:proofErr w:type="spellStart"/>
+      <w:r>
+        <w:t>cầu</w:t>
+      </w:r>
+      <w:proofErr w:type="spellEnd"/>
+      <w:r>
+        <w:t xml:space="preserve"> </w:t>
+      </w:r>
+      <w:proofErr w:type="spellStart"/>
+      <w:r>
+        <w:t>không</w:t>
+      </w:r>
+      <w:proofErr w:type="spellEnd"/>
+      <w:r>
+        <w:t xml:space="preserve"> (</w:t>
+      </w:r>
+      <w:proofErr w:type="spellStart"/>
+      <w:r>
+        <w:t>lương</w:t>
+      </w:r>
+      <w:proofErr w:type="spellEnd"/>
+      <w:r>
+        <w:t xml:space="preserve"> </w:t>
+      </w:r>
+      <w:proofErr w:type="spellStart"/>
+      <w:r>
+        <w:t>có</w:t>
+      </w:r>
+      <w:proofErr w:type="spellEnd"/>
+      <w:r>
+        <w:t xml:space="preserve"> </w:t>
+      </w:r>
+      <w:proofErr w:type="spellStart"/>
+      <w:r>
+        <w:t>tăng</w:t>
+      </w:r>
+      <w:proofErr w:type="spellEnd"/>
+      <w:r>
+        <w:t xml:space="preserve">, </w:t>
+      </w:r>
+      <w:proofErr w:type="spellStart"/>
+      <w:r>
+        <w:t>các</w:t>
+      </w:r>
+      <w:proofErr w:type="spellEnd"/>
+      <w:r>
+        <w:t xml:space="preserve"> </w:t>
+      </w:r>
+      <w:proofErr w:type="spellStart"/>
+      <w:r>
+        <w:t>bản</w:t>
+      </w:r>
+      <w:proofErr w:type="spellEnd"/>
+      <w:r>
+        <w:t xml:space="preserve"> </w:t>
+      </w:r>
+      <w:proofErr w:type="spellStart"/>
+      <w:r>
+        <w:t>ghi</w:t>
+      </w:r>
+      <w:proofErr w:type="spellEnd"/>
+      <w:r>
+        <w:t xml:space="preserve"> </w:t>
+      </w:r>
+      <w:proofErr w:type="spellStart"/>
+      <w:r>
+        <w:t>có</w:t>
+      </w:r>
+      <w:proofErr w:type="spellEnd"/>
+      <w:r>
+        <w:t xml:space="preserve"> </w:t>
+      </w:r>
+      <w:proofErr w:type="spellStart"/>
+      <w:r>
+        <w:t>bị</w:t>
+      </w:r>
+      <w:proofErr w:type="spellEnd"/>
+      <w:r>
+        <w:t xml:space="preserve"> </w:t>
+      </w:r>
+      <w:proofErr w:type="spellStart"/>
+      <w:r>
+        <w:t>xóa</w:t>
+      </w:r>
+      <w:proofErr w:type="spellEnd"/>
+      <w:r>
+        <w:t xml:space="preserve">, </w:t>
+      </w:r>
+      <w:proofErr w:type="spellStart"/>
+      <w:r>
+        <w:t>có</w:t>
+      </w:r>
+      <w:proofErr w:type="spellEnd"/>
+      <w:r>
+        <w:t xml:space="preserve"> </w:t>
+      </w:r>
+      <w:proofErr w:type="spellStart"/>
+      <w:r>
+        <w:t>thêm</w:t>
+      </w:r>
+      <w:proofErr w:type="spellEnd"/>
+      <w:r>
+        <w:t xml:space="preserve"> </w:t>
+      </w:r>
+      <w:proofErr w:type="spellStart"/>
+      <w:r>
+        <w:t>số</w:t>
+      </w:r>
+      <w:proofErr w:type="spellEnd"/>
+      <w:r>
+        <w:t xml:space="preserve"> phone </w:t>
+      </w:r>
+      <w:proofErr w:type="spellStart"/>
+      <w:r>
+        <w:t>mới</w:t>
+      </w:r>
+      <w:proofErr w:type="spellEnd"/>
+      <w:r>
+        <w:t>)? (1đ)</w:t>
       </w:r>
     </w:p>
     <w:p>
@@ -734,12 +3592,21 @@
           <w:bCs/>
         </w:rPr>
       </w:pPr>
+      <w:proofErr w:type="spellStart"/>
       <w:r>
         <w:rPr>
           <w:b/>
           <w:bCs/>
         </w:rPr>
-        <w:t>Câu 3: (LO1) (1đ)</w:t>
+        <w:t>Câu</w:t>
+      </w:r>
+      <w:proofErr w:type="spellEnd"/>
+      <w:r>
+        <w:rPr>
+          <w:b/>
+          <w:bCs/>
+        </w:rPr>
+        <w:t xml:space="preserve"> 3: (LO1) (1đ)</w:t>
       </w:r>
     </w:p>
     <w:p>
@@ -748,38 +3615,458 @@
         <w:ind w:firstLine="720"/>
         <w:jc w:val="both"/>
       </w:pPr>
-      <w:r>
-        <w:t xml:space="preserve">Viết after trigger trên bảng </w:t>
-      </w:r>
+      <w:proofErr w:type="spellStart"/>
+      <w:r>
+        <w:t>Viết</w:t>
+      </w:r>
+      <w:proofErr w:type="spellEnd"/>
+      <w:r>
+        <w:t xml:space="preserve"> after trigger </w:t>
+      </w:r>
+      <w:proofErr w:type="spellStart"/>
+      <w:r>
+        <w:t>trên</w:t>
+      </w:r>
+      <w:proofErr w:type="spellEnd"/>
+      <w:r>
+        <w:t xml:space="preserve"> </w:t>
+      </w:r>
+      <w:proofErr w:type="spellStart"/>
+      <w:r>
+        <w:t>bảng</w:t>
+      </w:r>
+      <w:proofErr w:type="spellEnd"/>
+      <w:r>
+        <w:t xml:space="preserve"> </w:t>
+      </w:r>
+      <w:proofErr w:type="spellStart"/>
       <w:r>
         <w:rPr>
           <w:i/>
           <w:iCs/>
         </w:rPr>
-        <w:t xml:space="preserve">ProductReview </w:t>
-      </w:r>
-      <w:r>
-        <w:t>sao cho khi cập nhật 1 bình luận (</w:t>
-      </w:r>
+        <w:t>ProductReview</w:t>
+      </w:r>
+      <w:proofErr w:type="spellEnd"/>
       <w:r>
         <w:rPr>
           <w:i/>
           <w:iCs/>
         </w:rPr>
-        <w:t>Comments</w:t>
-      </w:r>
-      <w:r>
-        <w:t xml:space="preserve">) cho 1 mã sản phẩm đã có thì liệt kê danh sách thông tin liên quan của sản phẩm gồm </w:t>
+        <w:t xml:space="preserve"> </w:t>
+      </w:r>
+      <w:proofErr w:type="spellStart"/>
+      <w:r>
+        <w:t>sao</w:t>
+      </w:r>
+      <w:proofErr w:type="spellEnd"/>
+      <w:r>
+        <w:t xml:space="preserve"> </w:t>
+      </w:r>
+      <w:proofErr w:type="spellStart"/>
+      <w:r>
+        <w:t>cho</w:t>
+      </w:r>
+      <w:proofErr w:type="spellEnd"/>
+      <w:r>
+        <w:t xml:space="preserve"> </w:t>
+      </w:r>
+      <w:proofErr w:type="spellStart"/>
+      <w:r>
+        <w:t>khi</w:t>
+      </w:r>
+      <w:proofErr w:type="spellEnd"/>
+      <w:r>
+        <w:t xml:space="preserve"> </w:t>
+      </w:r>
+      <w:proofErr w:type="spellStart"/>
+      <w:r>
+        <w:t>cập</w:t>
+      </w:r>
+      <w:proofErr w:type="spellEnd"/>
+      <w:r>
+        <w:t xml:space="preserve"> </w:t>
+      </w:r>
+      <w:proofErr w:type="spellStart"/>
+      <w:r>
+        <w:t>nhật</w:t>
+      </w:r>
+      <w:proofErr w:type="spellEnd"/>
+      <w:r>
+        <w:t xml:space="preserve"> 1 </w:t>
+      </w:r>
+      <w:proofErr w:type="spellStart"/>
+      <w:r>
+        <w:t>bình</w:t>
+      </w:r>
+      <w:proofErr w:type="spellEnd"/>
+      <w:r>
+        <w:t xml:space="preserve"> </w:t>
+      </w:r>
+      <w:proofErr w:type="spellStart"/>
+      <w:r>
+        <w:t>luận</w:t>
+      </w:r>
+      <w:proofErr w:type="spellEnd"/>
+      <w:r>
+        <w:t xml:space="preserve"> (</w:t>
       </w:r>
       <w:r>
         <w:rPr>
           <w:i/>
           <w:iCs/>
         </w:rPr>
-        <w:t>ProductID, Color, StandardCost, Rating, Comments</w:t>
-      </w:r>
-      <w:r>
-        <w:t>. Nếu mã sản phẩm không có thì báo lỗi và quay lui giao tác. Viết lệnh kích hoạt trigger cho 2 trường hợp trên (1đ)</w:t>
+        <w:t>Comments</w:t>
+      </w:r>
+      <w:r>
+        <w:t xml:space="preserve">) </w:t>
+      </w:r>
+      <w:proofErr w:type="spellStart"/>
+      <w:r>
+        <w:t>cho</w:t>
+      </w:r>
+      <w:proofErr w:type="spellEnd"/>
+      <w:r>
+        <w:t xml:space="preserve"> 1 </w:t>
+      </w:r>
+      <w:proofErr w:type="spellStart"/>
+      <w:r>
+        <w:t>mã</w:t>
+      </w:r>
+      <w:proofErr w:type="spellEnd"/>
+      <w:r>
+        <w:t xml:space="preserve"> </w:t>
+      </w:r>
+      <w:proofErr w:type="spellStart"/>
+      <w:r>
+        <w:t>sản</w:t>
+      </w:r>
+      <w:proofErr w:type="spellEnd"/>
+      <w:r>
+        <w:t xml:space="preserve"> </w:t>
+      </w:r>
+      <w:proofErr w:type="spellStart"/>
+      <w:r>
+        <w:t>phẩm</w:t>
+      </w:r>
+      <w:proofErr w:type="spellEnd"/>
+      <w:r>
+        <w:t xml:space="preserve"> </w:t>
+      </w:r>
+      <w:proofErr w:type="spellStart"/>
+      <w:r>
+        <w:t>đã</w:t>
+      </w:r>
+      <w:proofErr w:type="spellEnd"/>
+      <w:r>
+        <w:t xml:space="preserve"> </w:t>
+      </w:r>
+      <w:proofErr w:type="spellStart"/>
+      <w:r>
+        <w:t>có</w:t>
+      </w:r>
+      <w:proofErr w:type="spellEnd"/>
+      <w:r>
+        <w:t xml:space="preserve"> </w:t>
+      </w:r>
+      <w:proofErr w:type="spellStart"/>
+      <w:r>
+        <w:t>thì</w:t>
+      </w:r>
+      <w:proofErr w:type="spellEnd"/>
+      <w:r>
+        <w:t xml:space="preserve"> </w:t>
+      </w:r>
+      <w:proofErr w:type="spellStart"/>
+      <w:r>
+        <w:t>liệt</w:t>
+      </w:r>
+      <w:proofErr w:type="spellEnd"/>
+      <w:r>
+        <w:t xml:space="preserve"> </w:t>
+      </w:r>
+      <w:proofErr w:type="spellStart"/>
+      <w:r>
+        <w:t>kê</w:t>
+      </w:r>
+      <w:proofErr w:type="spellEnd"/>
+      <w:r>
+        <w:t xml:space="preserve"> </w:t>
+      </w:r>
+      <w:proofErr w:type="spellStart"/>
+      <w:r>
+        <w:t>danh</w:t>
+      </w:r>
+      <w:proofErr w:type="spellEnd"/>
+      <w:r>
+        <w:t xml:space="preserve"> </w:t>
+      </w:r>
+      <w:proofErr w:type="spellStart"/>
+      <w:r>
+        <w:t>sách</w:t>
+      </w:r>
+      <w:proofErr w:type="spellEnd"/>
+      <w:r>
+        <w:t xml:space="preserve"> </w:t>
+      </w:r>
+      <w:proofErr w:type="spellStart"/>
+      <w:r>
+        <w:t>thông</w:t>
+      </w:r>
+      <w:proofErr w:type="spellEnd"/>
+      <w:r>
+        <w:t xml:space="preserve"> tin </w:t>
+      </w:r>
+      <w:proofErr w:type="spellStart"/>
+      <w:r>
+        <w:t>liên</w:t>
+      </w:r>
+      <w:proofErr w:type="spellEnd"/>
+      <w:r>
+        <w:t xml:space="preserve"> </w:t>
+      </w:r>
+      <w:proofErr w:type="spellStart"/>
+      <w:r>
+        <w:t>quan</w:t>
+      </w:r>
+      <w:proofErr w:type="spellEnd"/>
+      <w:r>
+        <w:t xml:space="preserve"> </w:t>
+      </w:r>
+      <w:proofErr w:type="spellStart"/>
+      <w:r>
+        <w:t>của</w:t>
+      </w:r>
+      <w:proofErr w:type="spellEnd"/>
+      <w:r>
+        <w:t xml:space="preserve"> </w:t>
+      </w:r>
+      <w:proofErr w:type="spellStart"/>
+      <w:r>
+        <w:t>sản</w:t>
+      </w:r>
+      <w:proofErr w:type="spellEnd"/>
+      <w:r>
+        <w:t xml:space="preserve"> </w:t>
+      </w:r>
+      <w:proofErr w:type="spellStart"/>
+      <w:r>
+        <w:t>phẩm</w:t>
+      </w:r>
+      <w:proofErr w:type="spellEnd"/>
+      <w:r>
+        <w:t xml:space="preserve"> </w:t>
+      </w:r>
+      <w:proofErr w:type="spellStart"/>
+      <w:r>
+        <w:t>gồm</w:t>
+      </w:r>
+      <w:proofErr w:type="spellEnd"/>
+      <w:r>
+        <w:t xml:space="preserve"> </w:t>
+      </w:r>
+      <w:proofErr w:type="spellStart"/>
+      <w:r>
+        <w:rPr>
+          <w:i/>
+          <w:iCs/>
+        </w:rPr>
+        <w:t>ProductID</w:t>
+      </w:r>
+      <w:proofErr w:type="spellEnd"/>
+      <w:r>
+        <w:rPr>
+          <w:i/>
+          <w:iCs/>
+        </w:rPr>
+        <w:t xml:space="preserve">, Color, </w:t>
+      </w:r>
+      <w:proofErr w:type="spellStart"/>
+      <w:r>
+        <w:rPr>
+          <w:i/>
+          <w:iCs/>
+        </w:rPr>
+        <w:t>StandardCost</w:t>
+      </w:r>
+      <w:proofErr w:type="spellEnd"/>
+      <w:r>
+        <w:rPr>
+          <w:i/>
+          <w:iCs/>
+        </w:rPr>
+        <w:t>, Rating, Comments</w:t>
+      </w:r>
+      <w:r>
+        <w:t xml:space="preserve">. </w:t>
+      </w:r>
+      <w:proofErr w:type="spellStart"/>
+      <w:r>
+        <w:t>Nếu</w:t>
+      </w:r>
+      <w:proofErr w:type="spellEnd"/>
+      <w:r>
+        <w:t xml:space="preserve"> </w:t>
+      </w:r>
+      <w:proofErr w:type="spellStart"/>
+      <w:r>
+        <w:t>mã</w:t>
+      </w:r>
+      <w:proofErr w:type="spellEnd"/>
+      <w:r>
+        <w:t xml:space="preserve"> </w:t>
+      </w:r>
+      <w:proofErr w:type="spellStart"/>
+      <w:r>
+        <w:t>sản</w:t>
+      </w:r>
+      <w:proofErr w:type="spellEnd"/>
+      <w:r>
+        <w:t xml:space="preserve"> </w:t>
+      </w:r>
+      <w:proofErr w:type="spellStart"/>
+      <w:r>
+        <w:t>phẩm</w:t>
+      </w:r>
+      <w:proofErr w:type="spellEnd"/>
+      <w:r>
+        <w:t xml:space="preserve"> </w:t>
+      </w:r>
+      <w:proofErr w:type="spellStart"/>
+      <w:r>
+        <w:t>không</w:t>
+      </w:r>
+      <w:proofErr w:type="spellEnd"/>
+      <w:r>
+        <w:t xml:space="preserve"> </w:t>
+      </w:r>
+      <w:proofErr w:type="spellStart"/>
+      <w:r>
+        <w:t>có</w:t>
+      </w:r>
+      <w:proofErr w:type="spellEnd"/>
+      <w:r>
+        <w:t xml:space="preserve"> </w:t>
+      </w:r>
+      <w:proofErr w:type="spellStart"/>
+      <w:r>
+        <w:t>thì</w:t>
+      </w:r>
+      <w:proofErr w:type="spellEnd"/>
+      <w:r>
+        <w:t xml:space="preserve"> </w:t>
+      </w:r>
+      <w:proofErr w:type="spellStart"/>
+      <w:r>
+        <w:t>báo</w:t>
+      </w:r>
+      <w:proofErr w:type="spellEnd"/>
+      <w:r>
+        <w:t xml:space="preserve"> </w:t>
+      </w:r>
+      <w:proofErr w:type="spellStart"/>
+      <w:r>
+        <w:t>lỗi</w:t>
+      </w:r>
+      <w:proofErr w:type="spellEnd"/>
+      <w:r>
+        <w:t xml:space="preserve"> </w:t>
+      </w:r>
+      <w:proofErr w:type="spellStart"/>
+      <w:r>
+        <w:t>và</w:t>
+      </w:r>
+      <w:proofErr w:type="spellEnd"/>
+      <w:r>
+        <w:t xml:space="preserve"> quay </w:t>
+      </w:r>
+      <w:proofErr w:type="spellStart"/>
+      <w:r>
+        <w:t>lui</w:t>
+      </w:r>
+      <w:proofErr w:type="spellEnd"/>
+      <w:r>
+        <w:t xml:space="preserve"> </w:t>
+      </w:r>
+      <w:proofErr w:type="spellStart"/>
+      <w:r>
+        <w:t>giao</w:t>
+      </w:r>
+      <w:proofErr w:type="spellEnd"/>
+      <w:r>
+        <w:t xml:space="preserve"> </w:t>
+      </w:r>
+      <w:proofErr w:type="spellStart"/>
+      <w:r>
+        <w:t>tác</w:t>
+      </w:r>
+      <w:proofErr w:type="spellEnd"/>
+      <w:r>
+        <w:t xml:space="preserve">. </w:t>
+      </w:r>
+      <w:proofErr w:type="spellStart"/>
+      <w:r>
+        <w:t>Viết</w:t>
+      </w:r>
+      <w:proofErr w:type="spellEnd"/>
+      <w:r>
+        <w:t xml:space="preserve"> </w:t>
+      </w:r>
+      <w:proofErr w:type="spellStart"/>
+      <w:r>
+        <w:t>lệnh</w:t>
+      </w:r>
+      <w:proofErr w:type="spellEnd"/>
+      <w:r>
+        <w:t xml:space="preserve"> </w:t>
+      </w:r>
+      <w:proofErr w:type="spellStart"/>
+      <w:r>
+        <w:t>kích</w:t>
+      </w:r>
+      <w:proofErr w:type="spellEnd"/>
+      <w:r>
+        <w:t xml:space="preserve"> </w:t>
+      </w:r>
+      <w:proofErr w:type="spellStart"/>
+      <w:r>
+        <w:t>hoạt</w:t>
+      </w:r>
+      <w:proofErr w:type="spellEnd"/>
+      <w:r>
+        <w:t xml:space="preserve"> trigger </w:t>
+      </w:r>
+      <w:proofErr w:type="spellStart"/>
+      <w:r>
+        <w:t>cho</w:t>
+      </w:r>
+      <w:proofErr w:type="spellEnd"/>
+      <w:r>
+        <w:t xml:space="preserve"> 2 </w:t>
+      </w:r>
+      <w:proofErr w:type="spellStart"/>
+      <w:r>
+        <w:t>trường</w:t>
+      </w:r>
+      <w:proofErr w:type="spellEnd"/>
+      <w:r>
+        <w:t xml:space="preserve"> </w:t>
+      </w:r>
+      <w:proofErr w:type="spellStart"/>
+      <w:r>
+        <w:t>hợp</w:t>
+      </w:r>
+      <w:proofErr w:type="spellEnd"/>
+      <w:r>
+        <w:t xml:space="preserve"> </w:t>
+      </w:r>
+      <w:proofErr w:type="spellStart"/>
+      <w:r>
+        <w:t>trên</w:t>
+      </w:r>
+      <w:proofErr w:type="spellEnd"/>
+      <w:r>
+        <w:t xml:space="preserve"> (1đ)</w:t>
       </w:r>
       <w:r>
         <w:tab/>
@@ -809,10 +4096,9 @@
           <w:i/>
           <w:iCs/>
         </w:rPr>
-        <w:t>-----------------Hết-----------------</w:t>
-      </w:r>
-    </w:p>
-    <w:p>
+        <w:t>-----------------</w:t>
+      </w:r>
+      <w:proofErr w:type="spellStart"/>
       <w:r>
         <w:rPr>
           <w:b/>
@@ -820,21 +4106,20 @@
           <w:i/>
           <w:iCs/>
         </w:rPr>
-        <w:t>Lưu ý:</w:t>
-      </w:r>
-      <w:r>
-        <w:tab/>
-      </w:r>
-    </w:p>
-    <w:p>
-      <w:pPr>
+        <w:t>Hết</w:t>
+      </w:r>
+      <w:proofErr w:type="spellEnd"/>
+      <w:r>
         <w:rPr>
           <w:b/>
           <w:bCs/>
           <w:i/>
           <w:iCs/>
         </w:rPr>
-      </w:pPr>
+        <w:t>-----------------</w:t>
+      </w:r>
+    </w:p>
+    <w:p>
       <w:r>
         <w:rPr>
           <w:b/>
@@ -842,8 +4127,152 @@
           <w:i/>
           <w:iCs/>
         </w:rPr>
-        <w:t>Được sử dụng tờ giấy A4 chép tay</w:t>
-      </w:r>
+        <w:t>Lưu ý:</w:t>
+      </w:r>
+      <w:r>
+        <w:tab/>
+      </w:r>
+    </w:p>
+    <w:p>
+      <w:pPr>
+        <w:rPr>
+          <w:b/>
+          <w:bCs/>
+          <w:i/>
+          <w:iCs/>
+        </w:rPr>
+      </w:pPr>
+      <w:proofErr w:type="spellStart"/>
+      <w:r>
+        <w:rPr>
+          <w:b/>
+          <w:bCs/>
+          <w:i/>
+          <w:iCs/>
+        </w:rPr>
+        <w:t>Được</w:t>
+      </w:r>
+      <w:proofErr w:type="spellEnd"/>
+      <w:r>
+        <w:rPr>
+          <w:b/>
+          <w:bCs/>
+          <w:i/>
+          <w:iCs/>
+        </w:rPr>
+        <w:t xml:space="preserve"> </w:t>
+      </w:r>
+      <w:proofErr w:type="spellStart"/>
+      <w:r>
+        <w:rPr>
+          <w:b/>
+          <w:bCs/>
+          <w:i/>
+          <w:iCs/>
+        </w:rPr>
+        <w:t>sử</w:t>
+      </w:r>
+      <w:proofErr w:type="spellEnd"/>
+      <w:r>
+        <w:rPr>
+          <w:b/>
+          <w:bCs/>
+          <w:i/>
+          <w:iCs/>
+        </w:rPr>
+        <w:t xml:space="preserve"> </w:t>
+      </w:r>
+      <w:proofErr w:type="spellStart"/>
+      <w:r>
+        <w:rPr>
+          <w:b/>
+          <w:bCs/>
+          <w:i/>
+          <w:iCs/>
+        </w:rPr>
+        <w:t>dụng</w:t>
+      </w:r>
+      <w:proofErr w:type="spellEnd"/>
+      <w:r>
+        <w:rPr>
+          <w:b/>
+          <w:bCs/>
+          <w:i/>
+          <w:iCs/>
+        </w:rPr>
+        <w:t xml:space="preserve"> </w:t>
+      </w:r>
+      <w:proofErr w:type="spellStart"/>
+      <w:r>
+        <w:rPr>
+          <w:b/>
+          <w:bCs/>
+          <w:i/>
+          <w:iCs/>
+        </w:rPr>
+        <w:t>tờ</w:t>
+      </w:r>
+      <w:proofErr w:type="spellEnd"/>
+      <w:r>
+        <w:rPr>
+          <w:b/>
+          <w:bCs/>
+          <w:i/>
+          <w:iCs/>
+        </w:rPr>
+        <w:t xml:space="preserve"> </w:t>
+      </w:r>
+      <w:proofErr w:type="spellStart"/>
+      <w:r>
+        <w:rPr>
+          <w:b/>
+          <w:bCs/>
+          <w:i/>
+          <w:iCs/>
+        </w:rPr>
+        <w:t>giấy</w:t>
+      </w:r>
+      <w:proofErr w:type="spellEnd"/>
+      <w:r>
+        <w:rPr>
+          <w:b/>
+          <w:bCs/>
+          <w:i/>
+          <w:iCs/>
+        </w:rPr>
+        <w:t xml:space="preserve"> A4 </w:t>
+      </w:r>
+      <w:proofErr w:type="spellStart"/>
+      <w:r>
+        <w:rPr>
+          <w:b/>
+          <w:bCs/>
+          <w:i/>
+          <w:iCs/>
+        </w:rPr>
+        <w:t>chép</w:t>
+      </w:r>
+      <w:proofErr w:type="spellEnd"/>
+      <w:r>
+        <w:rPr>
+          <w:b/>
+          <w:bCs/>
+          <w:i/>
+          <w:iCs/>
+        </w:rPr>
+        <w:t xml:space="preserve"> </w:t>
+      </w:r>
+      <w:proofErr w:type="spellStart"/>
+      <w:r>
+        <w:rPr>
+          <w:b/>
+          <w:bCs/>
+          <w:i/>
+          <w:iCs/>
+        </w:rPr>
+        <w:t>tay</w:t>
+      </w:r>
+      <w:proofErr w:type="spellEnd"/>
     </w:p>
     <w:p/>
     <w:sectPr>

</xml_diff>